<commit_message>
Updated Gantt and Documentation to reflect current standing
</commit_message>
<xml_diff>
--- a/IPA Josiah Spilker Godiz.docx
+++ b/IPA Josiah Spilker Godiz.docx
@@ -328,7 +328,7 @@
           <w:r>
             <w:fldChar w:fldCharType="separate"/>
           </w:r>
-          <w:hyperlink w:anchor="_Toc228438082" w:history="1">
+          <w:hyperlink w:anchor="_Toc228774630" w:history="1">
             <w:r>
               <w:rPr>
                 <w:rStyle w:val="Hyperlink"/>
@@ -355,7 +355,7 @@
                 <w:noProof/>
                 <w:webHidden/>
               </w:rPr>
-              <w:instrText xml:space="preserve"> PAGEREF _Toc228438082 \h </w:instrText>
+              <w:instrText xml:space="preserve"> PAGEREF _Toc228774630 \h </w:instrText>
             </w:r>
             <w:r>
               <w:rPr>
@@ -399,7 +399,7 @@
               <w:lang w:eastAsia="en-CH"/>
             </w:rPr>
           </w:pPr>
-          <w:hyperlink w:anchor="_Toc228438083" w:history="1">
+          <w:hyperlink w:anchor="_Toc228774631" w:history="1">
             <w:r>
               <w:rPr>
                 <w:rStyle w:val="Hyperlink"/>
@@ -441,7 +441,7 @@
                 <w:noProof/>
                 <w:webHidden/>
               </w:rPr>
-              <w:instrText xml:space="preserve"> PAGEREF _Toc228438083 \h </w:instrText>
+              <w:instrText xml:space="preserve"> PAGEREF _Toc228774631 \h </w:instrText>
             </w:r>
             <w:r>
               <w:rPr>
@@ -485,7 +485,7 @@
               <w:lang w:eastAsia="en-CH"/>
             </w:rPr>
           </w:pPr>
-          <w:hyperlink w:anchor="_Toc228438084" w:history="1">
+          <w:hyperlink w:anchor="_Toc228774632" w:history="1">
             <w:r>
               <w:rPr>
                 <w:rStyle w:val="Hyperlink"/>
@@ -527,7 +527,7 @@
                 <w:noProof/>
                 <w:webHidden/>
               </w:rPr>
-              <w:instrText xml:space="preserve"> PAGEREF _Toc228438084 \h </w:instrText>
+              <w:instrText xml:space="preserve"> PAGEREF _Toc228774632 \h </w:instrText>
             </w:r>
             <w:r>
               <w:rPr>
@@ -571,7 +571,7 @@
               <w:lang w:eastAsia="en-CH"/>
             </w:rPr>
           </w:pPr>
-          <w:hyperlink w:anchor="_Toc228438085" w:history="1">
+          <w:hyperlink w:anchor="_Toc228774633" w:history="1">
             <w:r>
               <w:rPr>
                 <w:rStyle w:val="Hyperlink"/>
@@ -613,7 +613,7 @@
                 <w:noProof/>
                 <w:webHidden/>
               </w:rPr>
-              <w:instrText xml:space="preserve"> PAGEREF _Toc228438085 \h </w:instrText>
+              <w:instrText xml:space="preserve"> PAGEREF _Toc228774633 \h </w:instrText>
             </w:r>
             <w:r>
               <w:rPr>
@@ -657,7 +657,7 @@
               <w:lang w:eastAsia="en-CH"/>
             </w:rPr>
           </w:pPr>
-          <w:hyperlink w:anchor="_Toc228438086" w:history="1">
+          <w:hyperlink w:anchor="_Toc228774634" w:history="1">
             <w:r>
               <w:rPr>
                 <w:rStyle w:val="Hyperlink"/>
@@ -699,7 +699,7 @@
                 <w:noProof/>
                 <w:webHidden/>
               </w:rPr>
-              <w:instrText xml:space="preserve"> PAGEREF _Toc228438086 \h </w:instrText>
+              <w:instrText xml:space="preserve"> PAGEREF _Toc228774634 \h </w:instrText>
             </w:r>
             <w:r>
               <w:rPr>
@@ -743,7 +743,7 @@
               <w:lang w:eastAsia="en-CH"/>
             </w:rPr>
           </w:pPr>
-          <w:hyperlink w:anchor="_Toc228438087" w:history="1">
+          <w:hyperlink w:anchor="_Toc228774635" w:history="1">
             <w:r>
               <w:rPr>
                 <w:rStyle w:val="Hyperlink"/>
@@ -785,7 +785,7 @@
                 <w:noProof/>
                 <w:webHidden/>
               </w:rPr>
-              <w:instrText xml:space="preserve"> PAGEREF _Toc228438087 \h </w:instrText>
+              <w:instrText xml:space="preserve"> PAGEREF _Toc228774635 \h </w:instrText>
             </w:r>
             <w:r>
               <w:rPr>
@@ -829,7 +829,7 @@
               <w:lang w:eastAsia="en-CH"/>
             </w:rPr>
           </w:pPr>
-          <w:hyperlink w:anchor="_Toc228438088" w:history="1">
+          <w:hyperlink w:anchor="_Toc228774636" w:history="1">
             <w:r>
               <w:rPr>
                 <w:rStyle w:val="Hyperlink"/>
@@ -871,7 +871,7 @@
                 <w:noProof/>
                 <w:webHidden/>
               </w:rPr>
-              <w:instrText xml:space="preserve"> PAGEREF _Toc228438088 \h </w:instrText>
+              <w:instrText xml:space="preserve"> PAGEREF _Toc228774636 \h </w:instrText>
             </w:r>
             <w:r>
               <w:rPr>
@@ -915,7 +915,7 @@
               <w:lang w:eastAsia="en-CH"/>
             </w:rPr>
           </w:pPr>
-          <w:hyperlink w:anchor="_Toc228438089" w:history="1">
+          <w:hyperlink w:anchor="_Toc228774637" w:history="1">
             <w:r>
               <w:rPr>
                 <w:rStyle w:val="Hyperlink"/>
@@ -957,7 +957,7 @@
                 <w:noProof/>
                 <w:webHidden/>
               </w:rPr>
-              <w:instrText xml:space="preserve"> PAGEREF _Toc228438089 \h </w:instrText>
+              <w:instrText xml:space="preserve"> PAGEREF _Toc228774637 \h </w:instrText>
             </w:r>
             <w:r>
               <w:rPr>
@@ -1001,7 +1001,7 @@
               <w:lang w:eastAsia="en-CH"/>
             </w:rPr>
           </w:pPr>
-          <w:hyperlink w:anchor="_Toc228438090" w:history="1">
+          <w:hyperlink w:anchor="_Toc228774638" w:history="1">
             <w:r>
               <w:rPr>
                 <w:rStyle w:val="Hyperlink"/>
@@ -1043,7 +1043,7 @@
                 <w:noProof/>
                 <w:webHidden/>
               </w:rPr>
-              <w:instrText xml:space="preserve"> PAGEREF _Toc228438090 \h </w:instrText>
+              <w:instrText xml:space="preserve"> PAGEREF _Toc228774638 \h </w:instrText>
             </w:r>
             <w:r>
               <w:rPr>
@@ -1087,7 +1087,7 @@
               <w:lang w:eastAsia="en-CH"/>
             </w:rPr>
           </w:pPr>
-          <w:hyperlink w:anchor="_Toc228438091" w:history="1">
+          <w:hyperlink w:anchor="_Toc228774639" w:history="1">
             <w:r>
               <w:rPr>
                 <w:rStyle w:val="Hyperlink"/>
@@ -1129,7 +1129,7 @@
                 <w:noProof/>
                 <w:webHidden/>
               </w:rPr>
-              <w:instrText xml:space="preserve"> PAGEREF _Toc228438091 \h </w:instrText>
+              <w:instrText xml:space="preserve"> PAGEREF _Toc228774639 \h </w:instrText>
             </w:r>
             <w:r>
               <w:rPr>
@@ -1173,7 +1173,7 @@
               <w:lang w:eastAsia="en-CH"/>
             </w:rPr>
           </w:pPr>
-          <w:hyperlink w:anchor="_Toc228438092" w:history="1">
+          <w:hyperlink w:anchor="_Toc228774640" w:history="1">
             <w:r>
               <w:rPr>
                 <w:rStyle w:val="Hyperlink"/>
@@ -1215,7 +1215,7 @@
                 <w:noProof/>
                 <w:webHidden/>
               </w:rPr>
-              <w:instrText xml:space="preserve"> PAGEREF _Toc228438092 \h </w:instrText>
+              <w:instrText xml:space="preserve"> PAGEREF _Toc228774640 \h </w:instrText>
             </w:r>
             <w:r>
               <w:rPr>
@@ -1259,7 +1259,7 @@
               <w:lang w:eastAsia="en-CH"/>
             </w:rPr>
           </w:pPr>
-          <w:hyperlink w:anchor="_Toc228438093" w:history="1">
+          <w:hyperlink w:anchor="_Toc228774641" w:history="1">
             <w:r>
               <w:rPr>
                 <w:rStyle w:val="Hyperlink"/>
@@ -1301,7 +1301,7 @@
                 <w:noProof/>
                 <w:webHidden/>
               </w:rPr>
-              <w:instrText xml:space="preserve"> PAGEREF _Toc228438093 \h </w:instrText>
+              <w:instrText xml:space="preserve"> PAGEREF _Toc228774641 \h </w:instrText>
             </w:r>
             <w:r>
               <w:rPr>
@@ -1345,7 +1345,7 @@
               <w:lang w:eastAsia="en-CH"/>
             </w:rPr>
           </w:pPr>
-          <w:hyperlink w:anchor="_Toc228438094" w:history="1">
+          <w:hyperlink w:anchor="_Toc228774642" w:history="1">
             <w:r>
               <w:rPr>
                 <w:rStyle w:val="Hyperlink"/>
@@ -1387,7 +1387,7 @@
                 <w:noProof/>
                 <w:webHidden/>
               </w:rPr>
-              <w:instrText xml:space="preserve"> PAGEREF _Toc228438094 \h </w:instrText>
+              <w:instrText xml:space="preserve"> PAGEREF _Toc228774642 \h </w:instrText>
             </w:r>
             <w:r>
               <w:rPr>
@@ -1431,7 +1431,7 @@
               <w:lang w:eastAsia="en-CH"/>
             </w:rPr>
           </w:pPr>
-          <w:hyperlink w:anchor="_Toc228438095" w:history="1">
+          <w:hyperlink w:anchor="_Toc228774643" w:history="1">
             <w:r>
               <w:rPr>
                 <w:rStyle w:val="Hyperlink"/>
@@ -1473,7 +1473,7 @@
                 <w:noProof/>
                 <w:webHidden/>
               </w:rPr>
-              <w:instrText xml:space="preserve"> PAGEREF _Toc228438095 \h </w:instrText>
+              <w:instrText xml:space="preserve"> PAGEREF _Toc228774643 \h </w:instrText>
             </w:r>
             <w:r>
               <w:rPr>
@@ -1517,7 +1517,7 @@
               <w:lang w:eastAsia="en-CH"/>
             </w:rPr>
           </w:pPr>
-          <w:hyperlink w:anchor="_Toc228438096" w:history="1">
+          <w:hyperlink w:anchor="_Toc228774644" w:history="1">
             <w:r>
               <w:rPr>
                 <w:rStyle w:val="Hyperlink"/>
@@ -1559,7 +1559,7 @@
                 <w:noProof/>
                 <w:webHidden/>
               </w:rPr>
-              <w:instrText xml:space="preserve"> PAGEREF _Toc228438096 \h </w:instrText>
+              <w:instrText xml:space="preserve"> PAGEREF _Toc228774644 \h </w:instrText>
             </w:r>
             <w:r>
               <w:rPr>
@@ -1603,7 +1603,7 @@
               <w:lang w:eastAsia="en-CH"/>
             </w:rPr>
           </w:pPr>
-          <w:hyperlink w:anchor="_Toc228438097" w:history="1">
+          <w:hyperlink w:anchor="_Toc228774645" w:history="1">
             <w:r>
               <w:rPr>
                 <w:rStyle w:val="Hyperlink"/>
@@ -1645,7 +1645,7 @@
                 <w:noProof/>
                 <w:webHidden/>
               </w:rPr>
-              <w:instrText xml:space="preserve"> PAGEREF _Toc228438097 \h </w:instrText>
+              <w:instrText xml:space="preserve"> PAGEREF _Toc228774645 \h </w:instrText>
             </w:r>
             <w:r>
               <w:rPr>
@@ -1689,7 +1689,7 @@
               <w:lang w:eastAsia="en-CH"/>
             </w:rPr>
           </w:pPr>
-          <w:hyperlink w:anchor="_Toc228438098" w:history="1">
+          <w:hyperlink w:anchor="_Toc228774646" w:history="1">
             <w:r>
               <w:rPr>
                 <w:rStyle w:val="Hyperlink"/>
@@ -1731,7 +1731,7 @@
                 <w:noProof/>
                 <w:webHidden/>
               </w:rPr>
-              <w:instrText xml:space="preserve"> PAGEREF _Toc228438098 \h </w:instrText>
+              <w:instrText xml:space="preserve"> PAGEREF _Toc228774646 \h </w:instrText>
             </w:r>
             <w:r>
               <w:rPr>
@@ -1774,7 +1774,7 @@
               <w:lang w:eastAsia="en-CH"/>
             </w:rPr>
           </w:pPr>
-          <w:hyperlink w:anchor="_Toc228438099" w:history="1">
+          <w:hyperlink w:anchor="_Toc228774647" w:history="1">
             <w:r>
               <w:rPr>
                 <w:rStyle w:val="Hyperlink"/>
@@ -1801,7 +1801,7 @@
                 <w:noProof/>
                 <w:webHidden/>
               </w:rPr>
-              <w:instrText xml:space="preserve"> PAGEREF _Toc228438099 \h </w:instrText>
+              <w:instrText xml:space="preserve"> PAGEREF _Toc228774647 \h </w:instrText>
             </w:r>
             <w:r>
               <w:rPr>
@@ -1844,7 +1844,7 @@
               <w:lang w:eastAsia="en-CH"/>
             </w:rPr>
           </w:pPr>
-          <w:hyperlink w:anchor="_Toc228438100" w:history="1">
+          <w:hyperlink w:anchor="_Toc228774648" w:history="1">
             <w:r>
               <w:rPr>
                 <w:rStyle w:val="Hyperlink"/>
@@ -1871,7 +1871,7 @@
                 <w:noProof/>
                 <w:webHidden/>
               </w:rPr>
-              <w:instrText xml:space="preserve"> PAGEREF _Toc228438100 \h </w:instrText>
+              <w:instrText xml:space="preserve"> PAGEREF _Toc228774648 \h </w:instrText>
             </w:r>
             <w:r>
               <w:rPr>
@@ -1915,7 +1915,7 @@
               <w:lang w:eastAsia="en-CH"/>
             </w:rPr>
           </w:pPr>
-          <w:hyperlink w:anchor="_Toc228438101" w:history="1">
+          <w:hyperlink w:anchor="_Toc228774649" w:history="1">
             <w:r>
               <w:rPr>
                 <w:rStyle w:val="Hyperlink"/>
@@ -1957,7 +1957,7 @@
                 <w:noProof/>
                 <w:webHidden/>
               </w:rPr>
-              <w:instrText xml:space="preserve"> PAGEREF _Toc228438101 \h </w:instrText>
+              <w:instrText xml:space="preserve"> PAGEREF _Toc228774649 \h </w:instrText>
             </w:r>
             <w:r>
               <w:rPr>
@@ -2001,7 +2001,7 @@
               <w:lang w:eastAsia="en-CH"/>
             </w:rPr>
           </w:pPr>
-          <w:hyperlink w:anchor="_Toc228438102" w:history="1">
+          <w:hyperlink w:anchor="_Toc228774650" w:history="1">
             <w:r>
               <w:rPr>
                 <w:rStyle w:val="Hyperlink"/>
@@ -2043,7 +2043,7 @@
                 <w:noProof/>
                 <w:webHidden/>
               </w:rPr>
-              <w:instrText xml:space="preserve"> PAGEREF _Toc228438102 \h </w:instrText>
+              <w:instrText xml:space="preserve"> PAGEREF _Toc228774650 \h </w:instrText>
             </w:r>
             <w:r>
               <w:rPr>
@@ -2086,7 +2086,7 @@
               <w:lang w:eastAsia="en-CH"/>
             </w:rPr>
           </w:pPr>
-          <w:hyperlink w:anchor="_Toc228438103" w:history="1">
+          <w:hyperlink w:anchor="_Toc228774651" w:history="1">
             <w:r>
               <w:rPr>
                 <w:rStyle w:val="Hyperlink"/>
@@ -2113,7 +2113,7 @@
                 <w:noProof/>
                 <w:webHidden/>
               </w:rPr>
-              <w:instrText xml:space="preserve"> PAGEREF _Toc228438103 \h </w:instrText>
+              <w:instrText xml:space="preserve"> PAGEREF _Toc228774651 \h </w:instrText>
             </w:r>
             <w:r>
               <w:rPr>
@@ -2156,7 +2156,7 @@
               <w:lang w:eastAsia="en-CH"/>
             </w:rPr>
           </w:pPr>
-          <w:hyperlink w:anchor="_Toc228438104" w:history="1">
+          <w:hyperlink w:anchor="_Toc228774652" w:history="1">
             <w:r>
               <w:rPr>
                 <w:rStyle w:val="Hyperlink"/>
@@ -2183,7 +2183,7 @@
                 <w:noProof/>
                 <w:webHidden/>
               </w:rPr>
-              <w:instrText xml:space="preserve"> PAGEREF _Toc228438104 \h </w:instrText>
+              <w:instrText xml:space="preserve"> PAGEREF _Toc228774652 \h </w:instrText>
             </w:r>
             <w:r>
               <w:rPr>
@@ -2226,7 +2226,7 @@
               <w:lang w:eastAsia="en-CH"/>
             </w:rPr>
           </w:pPr>
-          <w:hyperlink w:anchor="_Toc228438105" w:history="1">
+          <w:hyperlink w:anchor="_Toc228774653" w:history="1">
             <w:r>
               <w:rPr>
                 <w:rStyle w:val="Hyperlink"/>
@@ -2253,7 +2253,7 @@
                 <w:noProof/>
                 <w:webHidden/>
               </w:rPr>
-              <w:instrText xml:space="preserve"> PAGEREF _Toc228438105 \h </w:instrText>
+              <w:instrText xml:space="preserve"> PAGEREF _Toc228774653 \h </w:instrText>
             </w:r>
             <w:r>
               <w:rPr>
@@ -2296,7 +2296,7 @@
               <w:lang w:eastAsia="en-CH"/>
             </w:rPr>
           </w:pPr>
-          <w:hyperlink w:anchor="_Toc228438106" w:history="1">
+          <w:hyperlink w:anchor="_Toc228774654" w:history="1">
             <w:r>
               <w:rPr>
                 <w:rStyle w:val="Hyperlink"/>
@@ -2323,7 +2323,7 @@
                 <w:noProof/>
                 <w:webHidden/>
               </w:rPr>
-              <w:instrText xml:space="preserve"> PAGEREF _Toc228438106 \h </w:instrText>
+              <w:instrText xml:space="preserve"> PAGEREF _Toc228774654 \h </w:instrText>
             </w:r>
             <w:r>
               <w:rPr>
@@ -2366,7 +2366,7 @@
               <w:lang w:eastAsia="en-CH"/>
             </w:rPr>
           </w:pPr>
-          <w:hyperlink w:anchor="_Toc228438107" w:history="1">
+          <w:hyperlink w:anchor="_Toc228774655" w:history="1">
             <w:r>
               <w:rPr>
                 <w:rStyle w:val="Hyperlink"/>
@@ -2393,7 +2393,7 @@
                 <w:noProof/>
                 <w:webHidden/>
               </w:rPr>
-              <w:instrText xml:space="preserve"> PAGEREF _Toc228438107 \h </w:instrText>
+              <w:instrText xml:space="preserve"> PAGEREF _Toc228774655 \h </w:instrText>
             </w:r>
             <w:r>
               <w:rPr>
@@ -2436,7 +2436,7 @@
               <w:lang w:eastAsia="en-CH"/>
             </w:rPr>
           </w:pPr>
-          <w:hyperlink w:anchor="_Toc228438108" w:history="1">
+          <w:hyperlink w:anchor="_Toc228774656" w:history="1">
             <w:r>
               <w:rPr>
                 <w:rStyle w:val="Hyperlink"/>
@@ -2463,7 +2463,7 @@
                 <w:noProof/>
                 <w:webHidden/>
               </w:rPr>
-              <w:instrText xml:space="preserve"> PAGEREF _Toc228438108 \h </w:instrText>
+              <w:instrText xml:space="preserve"> PAGEREF _Toc228774656 \h </w:instrText>
             </w:r>
             <w:r>
               <w:rPr>
@@ -2507,7 +2507,7 @@
               <w:lang w:eastAsia="en-CH"/>
             </w:rPr>
           </w:pPr>
-          <w:hyperlink w:anchor="_Toc228438109" w:history="1">
+          <w:hyperlink w:anchor="_Toc228774657" w:history="1">
             <w:r>
               <w:rPr>
                 <w:rStyle w:val="Hyperlink"/>
@@ -2549,7 +2549,7 @@
                 <w:noProof/>
                 <w:webHidden/>
               </w:rPr>
-              <w:instrText xml:space="preserve"> PAGEREF _Toc228438109 \h </w:instrText>
+              <w:instrText xml:space="preserve"> PAGEREF _Toc228774657 \h </w:instrText>
             </w:r>
             <w:r>
               <w:rPr>
@@ -2593,7 +2593,7 @@
               <w:lang w:eastAsia="en-CH"/>
             </w:rPr>
           </w:pPr>
-          <w:hyperlink w:anchor="_Toc228438110" w:history="1">
+          <w:hyperlink w:anchor="_Toc228774658" w:history="1">
             <w:r>
               <w:rPr>
                 <w:rStyle w:val="Hyperlink"/>
@@ -2635,7 +2635,7 @@
                 <w:noProof/>
                 <w:webHidden/>
               </w:rPr>
-              <w:instrText xml:space="preserve"> PAGEREF _Toc228438110 \h </w:instrText>
+              <w:instrText xml:space="preserve"> PAGEREF _Toc228774658 \h </w:instrText>
             </w:r>
             <w:r>
               <w:rPr>
@@ -2679,7 +2679,7 @@
               <w:lang w:eastAsia="en-CH"/>
             </w:rPr>
           </w:pPr>
-          <w:hyperlink w:anchor="_Toc228438111" w:history="1">
+          <w:hyperlink w:anchor="_Toc228774659" w:history="1">
             <w:r>
               <w:rPr>
                 <w:rStyle w:val="Hyperlink"/>
@@ -2721,7 +2721,7 @@
                 <w:noProof/>
                 <w:webHidden/>
               </w:rPr>
-              <w:instrText xml:space="preserve"> PAGEREF _Toc228438111 \h </w:instrText>
+              <w:instrText xml:space="preserve"> PAGEREF _Toc228774659 \h </w:instrText>
             </w:r>
             <w:r>
               <w:rPr>
@@ -2764,13 +2764,13 @@
               <w:lang w:eastAsia="en-CH"/>
             </w:rPr>
           </w:pPr>
-          <w:hyperlink w:anchor="_Toc228438112" w:history="1">
+          <w:hyperlink w:anchor="_Toc228774660" w:history="1">
             <w:r>
               <w:rPr>
                 <w:rStyle w:val="Hyperlink"/>
                 <w:noProof/>
               </w:rPr>
-              <w:t>2.6.4 Fetchxml and Polymorphic lookups</w:t>
+              <w:t>2.6.4 FetchXML and Polymorphic lookups</w:t>
             </w:r>
             <w:r>
               <w:rPr>
@@ -2791,7 +2791,7 @@
                 <w:noProof/>
                 <w:webHidden/>
               </w:rPr>
-              <w:instrText xml:space="preserve"> PAGEREF _Toc228438112 \h </w:instrText>
+              <w:instrText xml:space="preserve"> PAGEREF _Toc228774660 \h </w:instrText>
             </w:r>
             <w:r>
               <w:rPr>
@@ -2835,7 +2835,7 @@
               <w:lang w:eastAsia="en-CH"/>
             </w:rPr>
           </w:pPr>
-          <w:hyperlink w:anchor="_Toc228438113" w:history="1">
+          <w:hyperlink w:anchor="_Toc228774661" w:history="1">
             <w:r>
               <w:rPr>
                 <w:rStyle w:val="Hyperlink"/>
@@ -2877,7 +2877,7 @@
                 <w:noProof/>
                 <w:webHidden/>
               </w:rPr>
-              <w:instrText xml:space="preserve"> PAGEREF _Toc228438113 \h </w:instrText>
+              <w:instrText xml:space="preserve"> PAGEREF _Toc228774661 \h </w:instrText>
             </w:r>
             <w:r>
               <w:rPr>
@@ -2921,7 +2921,7 @@
               <w:lang w:eastAsia="en-CH"/>
             </w:rPr>
           </w:pPr>
-          <w:hyperlink w:anchor="_Toc228438114" w:history="1">
+          <w:hyperlink w:anchor="_Toc228774662" w:history="1">
             <w:r>
               <w:rPr>
                 <w:rStyle w:val="Hyperlink"/>
@@ -2963,7 +2963,7 @@
                 <w:noProof/>
                 <w:webHidden/>
               </w:rPr>
-              <w:instrText xml:space="preserve"> PAGEREF _Toc228438114 \h </w:instrText>
+              <w:instrText xml:space="preserve"> PAGEREF _Toc228774662 \h </w:instrText>
             </w:r>
             <w:r>
               <w:rPr>
@@ -3007,7 +3007,7 @@
               <w:lang w:eastAsia="en-CH"/>
             </w:rPr>
           </w:pPr>
-          <w:hyperlink w:anchor="_Toc228438115" w:history="1">
+          <w:hyperlink w:anchor="_Toc228774663" w:history="1">
             <w:r>
               <w:rPr>
                 <w:rStyle w:val="Hyperlink"/>
@@ -3049,7 +3049,7 @@
                 <w:noProof/>
                 <w:webHidden/>
               </w:rPr>
-              <w:instrText xml:space="preserve"> PAGEREF _Toc228438115 \h </w:instrText>
+              <w:instrText xml:space="preserve"> PAGEREF _Toc228774663 \h </w:instrText>
             </w:r>
             <w:r>
               <w:rPr>
@@ -3093,7 +3093,7 @@
               <w:lang w:eastAsia="en-CH"/>
             </w:rPr>
           </w:pPr>
-          <w:hyperlink w:anchor="_Toc228438116" w:history="1">
+          <w:hyperlink w:anchor="_Toc228774664" w:history="1">
             <w:r>
               <w:rPr>
                 <w:rStyle w:val="Hyperlink"/>
@@ -3135,7 +3135,7 @@
                 <w:noProof/>
                 <w:webHidden/>
               </w:rPr>
-              <w:instrText xml:space="preserve"> PAGEREF _Toc228438116 \h </w:instrText>
+              <w:instrText xml:space="preserve"> PAGEREF _Toc228774664 \h </w:instrText>
             </w:r>
             <w:r>
               <w:rPr>
@@ -3179,7 +3179,7 @@
               <w:lang w:eastAsia="en-CH"/>
             </w:rPr>
           </w:pPr>
-          <w:hyperlink w:anchor="_Toc228438117" w:history="1">
+          <w:hyperlink w:anchor="_Toc228774665" w:history="1">
             <w:r>
               <w:rPr>
                 <w:rStyle w:val="Hyperlink"/>
@@ -3221,7 +3221,7 @@
                 <w:noProof/>
                 <w:webHidden/>
               </w:rPr>
-              <w:instrText xml:space="preserve"> PAGEREF _Toc228438117 \h </w:instrText>
+              <w:instrText xml:space="preserve"> PAGEREF _Toc228774665 \h </w:instrText>
             </w:r>
             <w:r>
               <w:rPr>
@@ -3264,7 +3264,7 @@
               <w:lang w:eastAsia="en-CH"/>
             </w:rPr>
           </w:pPr>
-          <w:hyperlink w:anchor="_Toc228438118" w:history="1">
+          <w:hyperlink w:anchor="_Toc228774666" w:history="1">
             <w:r>
               <w:rPr>
                 <w:rStyle w:val="Hyperlink"/>
@@ -3291,7 +3291,7 @@
                 <w:noProof/>
                 <w:webHidden/>
               </w:rPr>
-              <w:instrText xml:space="preserve"> PAGEREF _Toc228438118 \h </w:instrText>
+              <w:instrText xml:space="preserve"> PAGEREF _Toc228774666 \h </w:instrText>
             </w:r>
             <w:r>
               <w:rPr>
@@ -3334,7 +3334,7 @@
               <w:lang w:eastAsia="en-CH"/>
             </w:rPr>
           </w:pPr>
-          <w:hyperlink w:anchor="_Toc228438119" w:history="1">
+          <w:hyperlink w:anchor="_Toc228774667" w:history="1">
             <w:r>
               <w:rPr>
                 <w:rStyle w:val="Hyperlink"/>
@@ -3361,7 +3361,7 @@
                 <w:noProof/>
                 <w:webHidden/>
               </w:rPr>
-              <w:instrText xml:space="preserve"> PAGEREF _Toc228438119 \h </w:instrText>
+              <w:instrText xml:space="preserve"> PAGEREF _Toc228774667 \h </w:instrText>
             </w:r>
             <w:r>
               <w:rPr>
@@ -3404,7 +3404,7 @@
               <w:lang w:eastAsia="en-CH"/>
             </w:rPr>
           </w:pPr>
-          <w:hyperlink w:anchor="_Toc228438120" w:history="1">
+          <w:hyperlink w:anchor="_Toc228774668" w:history="1">
             <w:r>
               <w:rPr>
                 <w:rStyle w:val="Hyperlink"/>
@@ -3431,7 +3431,7 @@
                 <w:noProof/>
                 <w:webHidden/>
               </w:rPr>
-              <w:instrText xml:space="preserve"> PAGEREF _Toc228438120 \h </w:instrText>
+              <w:instrText xml:space="preserve"> PAGEREF _Toc228774668 \h </w:instrText>
             </w:r>
             <w:r>
               <w:rPr>
@@ -3475,7 +3475,7 @@
               <w:lang w:eastAsia="en-CH"/>
             </w:rPr>
           </w:pPr>
-          <w:hyperlink w:anchor="_Toc228438121" w:history="1">
+          <w:hyperlink w:anchor="_Toc228774669" w:history="1">
             <w:r>
               <w:rPr>
                 <w:rStyle w:val="Hyperlink"/>
@@ -3517,7 +3517,7 @@
                 <w:noProof/>
                 <w:webHidden/>
               </w:rPr>
-              <w:instrText xml:space="preserve"> PAGEREF _Toc228438121 \h </w:instrText>
+              <w:instrText xml:space="preserve"> PAGEREF _Toc228774669 \h </w:instrText>
             </w:r>
             <w:r>
               <w:rPr>
@@ -3560,7 +3560,7 @@
               <w:lang w:eastAsia="en-CH"/>
             </w:rPr>
           </w:pPr>
-          <w:hyperlink w:anchor="_Toc228438122" w:history="1">
+          <w:hyperlink w:anchor="_Toc228774670" w:history="1">
             <w:r>
               <w:rPr>
                 <w:rStyle w:val="Hyperlink"/>
@@ -3587,7 +3587,7 @@
                 <w:noProof/>
                 <w:webHidden/>
               </w:rPr>
-              <w:instrText xml:space="preserve"> PAGEREF _Toc228438122 \h </w:instrText>
+              <w:instrText xml:space="preserve"> PAGEREF _Toc228774670 \h </w:instrText>
             </w:r>
             <w:r>
               <w:rPr>
@@ -3630,7 +3630,7 @@
               <w:lang w:eastAsia="en-CH"/>
             </w:rPr>
           </w:pPr>
-          <w:hyperlink w:anchor="_Toc228438123" w:history="1">
+          <w:hyperlink w:anchor="_Toc228774671" w:history="1">
             <w:r>
               <w:rPr>
                 <w:rStyle w:val="Hyperlink"/>
@@ -3657,7 +3657,7 @@
                 <w:noProof/>
                 <w:webHidden/>
               </w:rPr>
-              <w:instrText xml:space="preserve"> PAGEREF _Toc228438123 \h </w:instrText>
+              <w:instrText xml:space="preserve"> PAGEREF _Toc228774671 \h </w:instrText>
             </w:r>
             <w:r>
               <w:rPr>
@@ -3700,7 +3700,7 @@
               <w:lang w:eastAsia="en-CH"/>
             </w:rPr>
           </w:pPr>
-          <w:hyperlink w:anchor="_Toc228438124" w:history="1">
+          <w:hyperlink w:anchor="_Toc228774672" w:history="1">
             <w:r>
               <w:rPr>
                 <w:rStyle w:val="Hyperlink"/>
@@ -3727,7 +3727,7 @@
                 <w:noProof/>
                 <w:webHidden/>
               </w:rPr>
-              <w:instrText xml:space="preserve"> PAGEREF _Toc228438124 \h </w:instrText>
+              <w:instrText xml:space="preserve"> PAGEREF _Toc228774672 \h </w:instrText>
             </w:r>
             <w:r>
               <w:rPr>
@@ -3770,7 +3770,7 @@
               <w:lang w:eastAsia="en-CH"/>
             </w:rPr>
           </w:pPr>
-          <w:hyperlink w:anchor="_Toc228438125" w:history="1">
+          <w:hyperlink w:anchor="_Toc228774673" w:history="1">
             <w:r>
               <w:rPr>
                 <w:rStyle w:val="Hyperlink"/>
@@ -3797,7 +3797,7 @@
                 <w:noProof/>
                 <w:webHidden/>
               </w:rPr>
-              <w:instrText xml:space="preserve"> PAGEREF _Toc228438125 \h </w:instrText>
+              <w:instrText xml:space="preserve"> PAGEREF _Toc228774673 \h </w:instrText>
             </w:r>
             <w:r>
               <w:rPr>
@@ -3840,7 +3840,7 @@
               <w:lang w:eastAsia="en-CH"/>
             </w:rPr>
           </w:pPr>
-          <w:hyperlink w:anchor="_Toc228438126" w:history="1">
+          <w:hyperlink w:anchor="_Toc228774674" w:history="1">
             <w:r>
               <w:rPr>
                 <w:rStyle w:val="Hyperlink"/>
@@ -3867,7 +3867,7 @@
                 <w:noProof/>
                 <w:webHidden/>
               </w:rPr>
-              <w:instrText xml:space="preserve"> PAGEREF _Toc228438126 \h </w:instrText>
+              <w:instrText xml:space="preserve"> PAGEREF _Toc228774674 \h </w:instrText>
             </w:r>
             <w:r>
               <w:rPr>
@@ -3911,7 +3911,7 @@
               <w:lang w:eastAsia="en-CH"/>
             </w:rPr>
           </w:pPr>
-          <w:hyperlink w:anchor="_Toc228438127" w:history="1">
+          <w:hyperlink w:anchor="_Toc228774675" w:history="1">
             <w:r>
               <w:rPr>
                 <w:rStyle w:val="Hyperlink"/>
@@ -3953,7 +3953,7 @@
                 <w:noProof/>
                 <w:webHidden/>
               </w:rPr>
-              <w:instrText xml:space="preserve"> PAGEREF _Toc228438127 \h </w:instrText>
+              <w:instrText xml:space="preserve"> PAGEREF _Toc228774675 \h </w:instrText>
             </w:r>
             <w:r>
               <w:rPr>
@@ -3997,7 +3997,7 @@
               <w:lang w:eastAsia="en-CH"/>
             </w:rPr>
           </w:pPr>
-          <w:hyperlink w:anchor="_Toc228438128" w:history="1">
+          <w:hyperlink w:anchor="_Toc228774676" w:history="1">
             <w:r>
               <w:rPr>
                 <w:rStyle w:val="Hyperlink"/>
@@ -4039,7 +4039,7 @@
                 <w:noProof/>
                 <w:webHidden/>
               </w:rPr>
-              <w:instrText xml:space="preserve"> PAGEREF _Toc228438128 \h </w:instrText>
+              <w:instrText xml:space="preserve"> PAGEREF _Toc228774676 \h </w:instrText>
             </w:r>
             <w:r>
               <w:rPr>
@@ -4082,7 +4082,7 @@
               <w:lang w:eastAsia="en-CH"/>
             </w:rPr>
           </w:pPr>
-          <w:hyperlink w:anchor="_Toc228438129" w:history="1">
+          <w:hyperlink w:anchor="_Toc228774677" w:history="1">
             <w:r>
               <w:rPr>
                 <w:rStyle w:val="Hyperlink"/>
@@ -4109,7 +4109,7 @@
                 <w:noProof/>
                 <w:webHidden/>
               </w:rPr>
-              <w:instrText xml:space="preserve"> PAGEREF _Toc228438129 \h </w:instrText>
+              <w:instrText xml:space="preserve"> PAGEREF _Toc228774677 \h </w:instrText>
             </w:r>
             <w:r>
               <w:rPr>
@@ -4152,7 +4152,7 @@
               <w:lang w:eastAsia="en-CH"/>
             </w:rPr>
           </w:pPr>
-          <w:hyperlink w:anchor="_Toc228438130" w:history="1">
+          <w:hyperlink w:anchor="_Toc228774678" w:history="1">
             <w:r>
               <w:rPr>
                 <w:rStyle w:val="Hyperlink"/>
@@ -4179,7 +4179,7 @@
                 <w:noProof/>
                 <w:webHidden/>
               </w:rPr>
-              <w:instrText xml:space="preserve"> PAGEREF _Toc228438130 \h </w:instrText>
+              <w:instrText xml:space="preserve"> PAGEREF _Toc228774678 \h </w:instrText>
             </w:r>
             <w:r>
               <w:rPr>
@@ -4212,9 +4212,8 @@
         </w:p>
         <w:p>
           <w:pPr>
-            <w:pStyle w:val="TOC3"/>
+            <w:pStyle w:val="TOC2"/>
             <w:tabs>
-              <w:tab w:val="left" w:pos="1440"/>
               <w:tab w:val="right" w:leader="dot" w:pos="9016"/>
             </w:tabs>
             <w:rPr>
@@ -4223,14 +4222,574 @@
               <w:lang w:eastAsia="en-CH"/>
             </w:rPr>
           </w:pPr>
-          <w:hyperlink w:anchor="_Toc228438131" w:history="1">
+          <w:hyperlink w:anchor="_Toc228774679" w:history="1">
             <w:r>
               <w:rPr>
                 <w:rStyle w:val="Hyperlink"/>
                 <w:noProof/>
-                <w:highlight w:val="red"/>
-              </w:rPr>
-              <w:t>5.3.3</w:t>
+              </w:rPr>
+              <w:t>5.2 Configure Model Driven App</w:t>
+            </w:r>
+            <w:r>
+              <w:rPr>
+                <w:noProof/>
+                <w:webHidden/>
+              </w:rPr>
+              <w:tab/>
+            </w:r>
+            <w:r>
+              <w:rPr>
+                <w:noProof/>
+                <w:webHidden/>
+              </w:rPr>
+              <w:fldChar w:fldCharType="begin"/>
+            </w:r>
+            <w:r>
+              <w:rPr>
+                <w:noProof/>
+                <w:webHidden/>
+              </w:rPr>
+              <w:instrText xml:space="preserve"> PAGEREF _Toc228774679 \h </w:instrText>
+            </w:r>
+            <w:r>
+              <w:rPr>
+                <w:noProof/>
+                <w:webHidden/>
+              </w:rPr>
+            </w:r>
+            <w:r>
+              <w:rPr>
+                <w:noProof/>
+                <w:webHidden/>
+              </w:rPr>
+              <w:fldChar w:fldCharType="separate"/>
+            </w:r>
+            <w:r>
+              <w:rPr>
+                <w:noProof/>
+                <w:webHidden/>
+              </w:rPr>
+              <w:t>47</w:t>
+            </w:r>
+            <w:r>
+              <w:rPr>
+                <w:noProof/>
+                <w:webHidden/>
+              </w:rPr>
+              <w:fldChar w:fldCharType="end"/>
+            </w:r>
+          </w:hyperlink>
+        </w:p>
+        <w:p>
+          <w:pPr>
+            <w:pStyle w:val="TOC2"/>
+            <w:tabs>
+              <w:tab w:val="right" w:leader="dot" w:pos="9016"/>
+            </w:tabs>
+            <w:rPr>
+              <w:rFonts w:eastAsiaTheme="minorEastAsia"/>
+              <w:noProof/>
+              <w:lang w:eastAsia="en-CH"/>
+            </w:rPr>
+          </w:pPr>
+          <w:hyperlink w:anchor="_Toc228774680" w:history="1">
+            <w:r>
+              <w:rPr>
+                <w:rStyle w:val="Hyperlink"/>
+                <w:noProof/>
+              </w:rPr>
+              <w:t>5.3 Set Up PCF Project in app</w:t>
+            </w:r>
+            <w:r>
+              <w:rPr>
+                <w:noProof/>
+                <w:webHidden/>
+              </w:rPr>
+              <w:tab/>
+            </w:r>
+            <w:r>
+              <w:rPr>
+                <w:noProof/>
+                <w:webHidden/>
+              </w:rPr>
+              <w:fldChar w:fldCharType="begin"/>
+            </w:r>
+            <w:r>
+              <w:rPr>
+                <w:noProof/>
+                <w:webHidden/>
+              </w:rPr>
+              <w:instrText xml:space="preserve"> PAGEREF _Toc228774680 \h </w:instrText>
+            </w:r>
+            <w:r>
+              <w:rPr>
+                <w:noProof/>
+                <w:webHidden/>
+              </w:rPr>
+            </w:r>
+            <w:r>
+              <w:rPr>
+                <w:noProof/>
+                <w:webHidden/>
+              </w:rPr>
+              <w:fldChar w:fldCharType="separate"/>
+            </w:r>
+            <w:r>
+              <w:rPr>
+                <w:noProof/>
+                <w:webHidden/>
+              </w:rPr>
+              <w:t>48</w:t>
+            </w:r>
+            <w:r>
+              <w:rPr>
+                <w:noProof/>
+                <w:webHidden/>
+              </w:rPr>
+              <w:fldChar w:fldCharType="end"/>
+            </w:r>
+          </w:hyperlink>
+        </w:p>
+        <w:p>
+          <w:pPr>
+            <w:pStyle w:val="TOC2"/>
+            <w:tabs>
+              <w:tab w:val="right" w:leader="dot" w:pos="9016"/>
+            </w:tabs>
+            <w:rPr>
+              <w:rFonts w:eastAsiaTheme="minorEastAsia"/>
+              <w:noProof/>
+              <w:lang w:eastAsia="en-CH"/>
+            </w:rPr>
+          </w:pPr>
+          <w:hyperlink w:anchor="_Toc228774681" w:history="1">
+            <w:r>
+              <w:rPr>
+                <w:rStyle w:val="Hyperlink"/>
+                <w:noProof/>
+              </w:rPr>
+              <w:t>5.4 Data Fetching Layer</w:t>
+            </w:r>
+            <w:r>
+              <w:rPr>
+                <w:noProof/>
+                <w:webHidden/>
+              </w:rPr>
+              <w:tab/>
+            </w:r>
+            <w:r>
+              <w:rPr>
+                <w:noProof/>
+                <w:webHidden/>
+              </w:rPr>
+              <w:fldChar w:fldCharType="begin"/>
+            </w:r>
+            <w:r>
+              <w:rPr>
+                <w:noProof/>
+                <w:webHidden/>
+              </w:rPr>
+              <w:instrText xml:space="preserve"> PAGEREF _Toc228774681 \h </w:instrText>
+            </w:r>
+            <w:r>
+              <w:rPr>
+                <w:noProof/>
+                <w:webHidden/>
+              </w:rPr>
+            </w:r>
+            <w:r>
+              <w:rPr>
+                <w:noProof/>
+                <w:webHidden/>
+              </w:rPr>
+              <w:fldChar w:fldCharType="separate"/>
+            </w:r>
+            <w:r>
+              <w:rPr>
+                <w:noProof/>
+                <w:webHidden/>
+              </w:rPr>
+              <w:t>49</w:t>
+            </w:r>
+            <w:r>
+              <w:rPr>
+                <w:noProof/>
+                <w:webHidden/>
+              </w:rPr>
+              <w:fldChar w:fldCharType="end"/>
+            </w:r>
+          </w:hyperlink>
+        </w:p>
+        <w:p>
+          <w:pPr>
+            <w:pStyle w:val="TOC2"/>
+            <w:tabs>
+              <w:tab w:val="right" w:leader="dot" w:pos="9016"/>
+            </w:tabs>
+            <w:rPr>
+              <w:rFonts w:eastAsiaTheme="minorEastAsia"/>
+              <w:noProof/>
+              <w:lang w:eastAsia="en-CH"/>
+            </w:rPr>
+          </w:pPr>
+          <w:hyperlink w:anchor="_Toc228774682" w:history="1">
+            <w:r>
+              <w:rPr>
+                <w:rStyle w:val="Hyperlink"/>
+                <w:noProof/>
+              </w:rPr>
+              <w:t>5.5 Field Type Handlers</w:t>
+            </w:r>
+            <w:r>
+              <w:rPr>
+                <w:noProof/>
+                <w:webHidden/>
+              </w:rPr>
+              <w:tab/>
+            </w:r>
+            <w:r>
+              <w:rPr>
+                <w:noProof/>
+                <w:webHidden/>
+              </w:rPr>
+              <w:fldChar w:fldCharType="begin"/>
+            </w:r>
+            <w:r>
+              <w:rPr>
+                <w:noProof/>
+                <w:webHidden/>
+              </w:rPr>
+              <w:instrText xml:space="preserve"> PAGEREF _Toc228774682 \h </w:instrText>
+            </w:r>
+            <w:r>
+              <w:rPr>
+                <w:noProof/>
+                <w:webHidden/>
+              </w:rPr>
+            </w:r>
+            <w:r>
+              <w:rPr>
+                <w:noProof/>
+                <w:webHidden/>
+              </w:rPr>
+              <w:fldChar w:fldCharType="separate"/>
+            </w:r>
+            <w:r>
+              <w:rPr>
+                <w:noProof/>
+                <w:webHidden/>
+              </w:rPr>
+              <w:t>50</w:t>
+            </w:r>
+            <w:r>
+              <w:rPr>
+                <w:noProof/>
+                <w:webHidden/>
+              </w:rPr>
+              <w:fldChar w:fldCharType="end"/>
+            </w:r>
+          </w:hyperlink>
+        </w:p>
+        <w:p>
+          <w:pPr>
+            <w:pStyle w:val="TOC2"/>
+            <w:tabs>
+              <w:tab w:val="right" w:leader="dot" w:pos="9016"/>
+            </w:tabs>
+            <w:rPr>
+              <w:rFonts w:eastAsiaTheme="minorEastAsia"/>
+              <w:noProof/>
+              <w:lang w:eastAsia="en-CH"/>
+            </w:rPr>
+          </w:pPr>
+          <w:hyperlink w:anchor="_Toc228774683" w:history="1">
+            <w:r>
+              <w:rPr>
+                <w:rStyle w:val="Hyperlink"/>
+                <w:noProof/>
+              </w:rPr>
+              <w:t>5.6 Comparison UI</w:t>
+            </w:r>
+            <w:r>
+              <w:rPr>
+                <w:noProof/>
+                <w:webHidden/>
+              </w:rPr>
+              <w:tab/>
+            </w:r>
+            <w:r>
+              <w:rPr>
+                <w:noProof/>
+                <w:webHidden/>
+              </w:rPr>
+              <w:fldChar w:fldCharType="begin"/>
+            </w:r>
+            <w:r>
+              <w:rPr>
+                <w:noProof/>
+                <w:webHidden/>
+              </w:rPr>
+              <w:instrText xml:space="preserve"> PAGEREF _Toc228774683 \h </w:instrText>
+            </w:r>
+            <w:r>
+              <w:rPr>
+                <w:noProof/>
+                <w:webHidden/>
+              </w:rPr>
+            </w:r>
+            <w:r>
+              <w:rPr>
+                <w:noProof/>
+                <w:webHidden/>
+              </w:rPr>
+              <w:fldChar w:fldCharType="separate"/>
+            </w:r>
+            <w:r>
+              <w:rPr>
+                <w:noProof/>
+                <w:webHidden/>
+              </w:rPr>
+              <w:t>51</w:t>
+            </w:r>
+            <w:r>
+              <w:rPr>
+                <w:noProof/>
+                <w:webHidden/>
+              </w:rPr>
+              <w:fldChar w:fldCharType="end"/>
+            </w:r>
+          </w:hyperlink>
+        </w:p>
+        <w:p>
+          <w:pPr>
+            <w:pStyle w:val="TOC2"/>
+            <w:tabs>
+              <w:tab w:val="right" w:leader="dot" w:pos="9016"/>
+            </w:tabs>
+            <w:rPr>
+              <w:rFonts w:eastAsiaTheme="minorEastAsia"/>
+              <w:noProof/>
+              <w:lang w:eastAsia="en-CH"/>
+            </w:rPr>
+          </w:pPr>
+          <w:hyperlink w:anchor="_Toc228774684" w:history="1">
+            <w:r>
+              <w:rPr>
+                <w:rStyle w:val="Hyperlink"/>
+                <w:noProof/>
+              </w:rPr>
+              <w:t>5.7 Merge &amp; Deactivation Logic</w:t>
+            </w:r>
+            <w:r>
+              <w:rPr>
+                <w:noProof/>
+                <w:webHidden/>
+              </w:rPr>
+              <w:tab/>
+            </w:r>
+            <w:r>
+              <w:rPr>
+                <w:noProof/>
+                <w:webHidden/>
+              </w:rPr>
+              <w:fldChar w:fldCharType="begin"/>
+            </w:r>
+            <w:r>
+              <w:rPr>
+                <w:noProof/>
+                <w:webHidden/>
+              </w:rPr>
+              <w:instrText xml:space="preserve"> PAGEREF _Toc228774684 \h </w:instrText>
+            </w:r>
+            <w:r>
+              <w:rPr>
+                <w:noProof/>
+                <w:webHidden/>
+              </w:rPr>
+            </w:r>
+            <w:r>
+              <w:rPr>
+                <w:noProof/>
+                <w:webHidden/>
+              </w:rPr>
+              <w:fldChar w:fldCharType="separate"/>
+            </w:r>
+            <w:r>
+              <w:rPr>
+                <w:noProof/>
+                <w:webHidden/>
+              </w:rPr>
+              <w:t>52</w:t>
+            </w:r>
+            <w:r>
+              <w:rPr>
+                <w:noProof/>
+                <w:webHidden/>
+              </w:rPr>
+              <w:fldChar w:fldCharType="end"/>
+            </w:r>
+          </w:hyperlink>
+        </w:p>
+        <w:p>
+          <w:pPr>
+            <w:pStyle w:val="TOC2"/>
+            <w:tabs>
+              <w:tab w:val="right" w:leader="dot" w:pos="9016"/>
+            </w:tabs>
+            <w:rPr>
+              <w:rFonts w:eastAsiaTheme="minorEastAsia"/>
+              <w:noProof/>
+              <w:lang w:eastAsia="en-CH"/>
+            </w:rPr>
+          </w:pPr>
+          <w:hyperlink w:anchor="_Toc228774685" w:history="1">
+            <w:r>
+              <w:rPr>
+                <w:rStyle w:val="Hyperlink"/>
+                <w:noProof/>
+              </w:rPr>
+              <w:t>5.8</w:t>
+            </w:r>
+            <w:r>
+              <w:rPr>
+                <w:noProof/>
+                <w:webHidden/>
+              </w:rPr>
+              <w:tab/>
+            </w:r>
+            <w:r>
+              <w:rPr>
+                <w:noProof/>
+                <w:webHidden/>
+              </w:rPr>
+              <w:fldChar w:fldCharType="begin"/>
+            </w:r>
+            <w:r>
+              <w:rPr>
+                <w:noProof/>
+                <w:webHidden/>
+              </w:rPr>
+              <w:instrText xml:space="preserve"> PAGEREF _Toc228774685 \h </w:instrText>
+            </w:r>
+            <w:r>
+              <w:rPr>
+                <w:noProof/>
+                <w:webHidden/>
+              </w:rPr>
+            </w:r>
+            <w:r>
+              <w:rPr>
+                <w:noProof/>
+                <w:webHidden/>
+              </w:rPr>
+              <w:fldChar w:fldCharType="separate"/>
+            </w:r>
+            <w:r>
+              <w:rPr>
+                <w:noProof/>
+                <w:webHidden/>
+              </w:rPr>
+              <w:t>53</w:t>
+            </w:r>
+            <w:r>
+              <w:rPr>
+                <w:noProof/>
+                <w:webHidden/>
+              </w:rPr>
+              <w:fldChar w:fldCharType="end"/>
+            </w:r>
+          </w:hyperlink>
+        </w:p>
+        <w:p>
+          <w:pPr>
+            <w:pStyle w:val="TOC2"/>
+            <w:tabs>
+              <w:tab w:val="right" w:leader="dot" w:pos="9016"/>
+            </w:tabs>
+            <w:rPr>
+              <w:rFonts w:eastAsiaTheme="minorEastAsia"/>
+              <w:noProof/>
+              <w:lang w:eastAsia="en-CH"/>
+            </w:rPr>
+          </w:pPr>
+          <w:hyperlink w:anchor="_Toc228774686" w:history="1">
+            <w:r>
+              <w:rPr>
+                <w:rStyle w:val="Hyperlink"/>
+                <w:noProof/>
+              </w:rPr>
+              <w:t>5.9</w:t>
+            </w:r>
+            <w:r>
+              <w:rPr>
+                <w:noProof/>
+                <w:webHidden/>
+              </w:rPr>
+              <w:tab/>
+            </w:r>
+            <w:r>
+              <w:rPr>
+                <w:noProof/>
+                <w:webHidden/>
+              </w:rPr>
+              <w:fldChar w:fldCharType="begin"/>
+            </w:r>
+            <w:r>
+              <w:rPr>
+                <w:noProof/>
+                <w:webHidden/>
+              </w:rPr>
+              <w:instrText xml:space="preserve"> PAGEREF _Toc228774686 \h </w:instrText>
+            </w:r>
+            <w:r>
+              <w:rPr>
+                <w:noProof/>
+                <w:webHidden/>
+              </w:rPr>
+            </w:r>
+            <w:r>
+              <w:rPr>
+                <w:noProof/>
+                <w:webHidden/>
+              </w:rPr>
+              <w:fldChar w:fldCharType="separate"/>
+            </w:r>
+            <w:r>
+              <w:rPr>
+                <w:noProof/>
+                <w:webHidden/>
+              </w:rPr>
+              <w:t>54</w:t>
+            </w:r>
+            <w:r>
+              <w:rPr>
+                <w:noProof/>
+                <w:webHidden/>
+              </w:rPr>
+              <w:fldChar w:fldCharType="end"/>
+            </w:r>
+          </w:hyperlink>
+        </w:p>
+        <w:p>
+          <w:pPr>
+            <w:pStyle w:val="TOC1"/>
+            <w:tabs>
+              <w:tab w:val="left" w:pos="480"/>
+              <w:tab w:val="right" w:leader="dot" w:pos="9016"/>
+            </w:tabs>
+            <w:rPr>
+              <w:rFonts w:eastAsiaTheme="minorEastAsia"/>
+              <w:noProof/>
+              <w:lang w:eastAsia="en-CH"/>
+            </w:rPr>
+          </w:pPr>
+          <w:hyperlink w:anchor="_Toc228774687" w:history="1">
+            <w:r>
+              <w:rPr>
+                <w:rStyle w:val="Hyperlink"/>
+                <w:noProof/>
+              </w:rPr>
+              <w:t>6</w:t>
             </w:r>
             <w:r>
               <w:rPr>
@@ -4244,9 +4803,8 @@
               <w:rPr>
                 <w:rStyle w:val="Hyperlink"/>
                 <w:noProof/>
-                <w:highlight w:val="red"/>
-              </w:rPr>
-              <w:t>EXAMPLE: Weekly Cost Overview flow</w:t>
+              </w:rPr>
+              <w:t>Control</w:t>
             </w:r>
             <w:r>
               <w:rPr>
@@ -4267,7 +4825,7 @@
                 <w:noProof/>
                 <w:webHidden/>
               </w:rPr>
-              <w:instrText xml:space="preserve"> PAGEREF _Toc228438131 \h </w:instrText>
+              <w:instrText xml:space="preserve"> PAGEREF _Toc228774687 \h </w:instrText>
             </w:r>
             <w:r>
               <w:rPr>
@@ -4287,7 +4845,7 @@
                 <w:noProof/>
                 <w:webHidden/>
               </w:rPr>
-              <w:t>47</w:t>
+              <w:t>55</w:t>
             </w:r>
             <w:r>
               <w:rPr>
@@ -4311,13 +4869,13 @@
               <w:lang w:eastAsia="en-CH"/>
             </w:rPr>
           </w:pPr>
-          <w:hyperlink w:anchor="_Toc228438132" w:history="1">
+          <w:hyperlink w:anchor="_Toc228774688" w:history="1">
             <w:r>
               <w:rPr>
                 <w:rStyle w:val="Hyperlink"/>
                 <w:noProof/>
               </w:rPr>
-              <w:t>5.4</w:t>
+              <w:t>6.1</w:t>
             </w:r>
             <w:r>
               <w:rPr>
@@ -4332,7 +4890,7 @@
                 <w:rStyle w:val="Hyperlink"/>
                 <w:noProof/>
               </w:rPr>
-              <w:t>Questions</w:t>
+              <w:t>Test Protocol</w:t>
             </w:r>
             <w:r>
               <w:rPr>
@@ -4353,7 +4911,7 @@
                 <w:noProof/>
                 <w:webHidden/>
               </w:rPr>
-              <w:instrText xml:space="preserve"> PAGEREF _Toc228438132 \h </w:instrText>
+              <w:instrText xml:space="preserve"> PAGEREF _Toc228774688 \h </w:instrText>
             </w:r>
             <w:r>
               <w:rPr>
@@ -4373,7 +4931,93 @@
                 <w:noProof/>
                 <w:webHidden/>
               </w:rPr>
-              <w:t>49</w:t>
+              <w:t>55</w:t>
+            </w:r>
+            <w:r>
+              <w:rPr>
+                <w:noProof/>
+                <w:webHidden/>
+              </w:rPr>
+              <w:fldChar w:fldCharType="end"/>
+            </w:r>
+          </w:hyperlink>
+        </w:p>
+        <w:p>
+          <w:pPr>
+            <w:pStyle w:val="TOC2"/>
+            <w:tabs>
+              <w:tab w:val="left" w:pos="960"/>
+              <w:tab w:val="right" w:leader="dot" w:pos="9016"/>
+            </w:tabs>
+            <w:rPr>
+              <w:rFonts w:eastAsiaTheme="minorEastAsia"/>
+              <w:noProof/>
+              <w:lang w:eastAsia="en-CH"/>
+            </w:rPr>
+          </w:pPr>
+          <w:hyperlink w:anchor="_Toc228774689" w:history="1">
+            <w:r>
+              <w:rPr>
+                <w:rStyle w:val="Hyperlink"/>
+                <w:noProof/>
+              </w:rPr>
+              <w:t>6.3</w:t>
+            </w:r>
+            <w:r>
+              <w:rPr>
+                <w:rFonts w:eastAsiaTheme="minorEastAsia"/>
+                <w:noProof/>
+                <w:lang w:eastAsia="en-CH"/>
+              </w:rPr>
+              <w:tab/>
+            </w:r>
+            <w:r>
+              <w:rPr>
+                <w:rStyle w:val="Hyperlink"/>
+                <w:noProof/>
+              </w:rPr>
+              <w:t>Boundary Testing</w:t>
+            </w:r>
+            <w:r>
+              <w:rPr>
+                <w:noProof/>
+                <w:webHidden/>
+              </w:rPr>
+              <w:tab/>
+            </w:r>
+            <w:r>
+              <w:rPr>
+                <w:noProof/>
+                <w:webHidden/>
+              </w:rPr>
+              <w:fldChar w:fldCharType="begin"/>
+            </w:r>
+            <w:r>
+              <w:rPr>
+                <w:noProof/>
+                <w:webHidden/>
+              </w:rPr>
+              <w:instrText xml:space="preserve"> PAGEREF _Toc228774689 \h </w:instrText>
+            </w:r>
+            <w:r>
+              <w:rPr>
+                <w:noProof/>
+                <w:webHidden/>
+              </w:rPr>
+            </w:r>
+            <w:r>
+              <w:rPr>
+                <w:noProof/>
+                <w:webHidden/>
+              </w:rPr>
+              <w:fldChar w:fldCharType="separate"/>
+            </w:r>
+            <w:r>
+              <w:rPr>
+                <w:noProof/>
+                <w:webHidden/>
+              </w:rPr>
+              <w:t>58</w:t>
             </w:r>
             <w:r>
               <w:rPr>
@@ -4397,13 +5041,13 @@
               <w:lang w:eastAsia="en-CH"/>
             </w:rPr>
           </w:pPr>
-          <w:hyperlink w:anchor="_Toc228438133" w:history="1">
+          <w:hyperlink w:anchor="_Toc228774690" w:history="1">
             <w:r>
               <w:rPr>
                 <w:rStyle w:val="Hyperlink"/>
                 <w:noProof/>
               </w:rPr>
-              <w:t>6</w:t>
+              <w:t>7</w:t>
             </w:r>
             <w:r>
               <w:rPr>
@@ -4418,7 +5062,7 @@
                 <w:rStyle w:val="Hyperlink"/>
                 <w:noProof/>
               </w:rPr>
-              <w:t>Control</w:t>
+              <w:t>Evaluate</w:t>
             </w:r>
             <w:r>
               <w:rPr>
@@ -4439,7 +5083,7 @@
                 <w:noProof/>
                 <w:webHidden/>
               </w:rPr>
-              <w:instrText xml:space="preserve"> PAGEREF _Toc228438133 \h </w:instrText>
+              <w:instrText xml:space="preserve"> PAGEREF _Toc228774690 \h </w:instrText>
             </w:r>
             <w:r>
               <w:rPr>
@@ -4459,7 +5103,7 @@
                 <w:noProof/>
                 <w:webHidden/>
               </w:rPr>
-              <w:t>50</w:t>
+              <w:t>59</w:t>
             </w:r>
             <w:r>
               <w:rPr>
@@ -4483,13 +5127,13 @@
               <w:lang w:eastAsia="en-CH"/>
             </w:rPr>
           </w:pPr>
-          <w:hyperlink w:anchor="_Toc228438134" w:history="1">
+          <w:hyperlink w:anchor="_Toc228774691" w:history="1">
             <w:r>
               <w:rPr>
                 <w:rStyle w:val="Hyperlink"/>
                 <w:noProof/>
               </w:rPr>
-              <w:t>6.1</w:t>
+              <w:t>7.1</w:t>
             </w:r>
             <w:r>
               <w:rPr>
@@ -4504,7 +5148,7 @@
                 <w:rStyle w:val="Hyperlink"/>
                 <w:noProof/>
               </w:rPr>
-              <w:t>Test Protocol</w:t>
+              <w:t>Reflection</w:t>
             </w:r>
             <w:r>
               <w:rPr>
@@ -4525,7 +5169,7 @@
                 <w:noProof/>
                 <w:webHidden/>
               </w:rPr>
-              <w:instrText xml:space="preserve"> PAGEREF _Toc228438134 \h </w:instrText>
+              <w:instrText xml:space="preserve"> PAGEREF _Toc228774691 \h </w:instrText>
             </w:r>
             <w:r>
               <w:rPr>
@@ -4545,7 +5189,7 @@
                 <w:noProof/>
                 <w:webHidden/>
               </w:rPr>
-              <w:t>50</w:t>
+              <w:t>60</w:t>
             </w:r>
             <w:r>
               <w:rPr>
@@ -4569,13 +5213,13 @@
               <w:lang w:eastAsia="en-CH"/>
             </w:rPr>
           </w:pPr>
-          <w:hyperlink w:anchor="_Toc228438135" w:history="1">
+          <w:hyperlink w:anchor="_Toc228774692" w:history="1">
             <w:r>
               <w:rPr>
                 <w:rStyle w:val="Hyperlink"/>
                 <w:noProof/>
               </w:rPr>
-              <w:t>6.3</w:t>
+              <w:t>7.2</w:t>
             </w:r>
             <w:r>
               <w:rPr>
@@ -4590,7 +5234,7 @@
                 <w:rStyle w:val="Hyperlink"/>
                 <w:noProof/>
               </w:rPr>
-              <w:t>Boundary Testing</w:t>
+              <w:t>IPERKA concerns</w:t>
             </w:r>
             <w:r>
               <w:rPr>
@@ -4611,7 +5255,7 @@
                 <w:noProof/>
                 <w:webHidden/>
               </w:rPr>
-              <w:instrText xml:space="preserve"> PAGEREF _Toc228438135 \h </w:instrText>
+              <w:instrText xml:space="preserve"> PAGEREF _Toc228774692 \h </w:instrText>
             </w:r>
             <w:r>
               <w:rPr>
@@ -4631,7 +5275,163 @@
                 <w:noProof/>
                 <w:webHidden/>
               </w:rPr>
-              <w:t>53</w:t>
+              <w:t>61</w:t>
+            </w:r>
+            <w:r>
+              <w:rPr>
+                <w:noProof/>
+                <w:webHidden/>
+              </w:rPr>
+              <w:fldChar w:fldCharType="end"/>
+            </w:r>
+          </w:hyperlink>
+        </w:p>
+        <w:p>
+          <w:pPr>
+            <w:pStyle w:val="TOC2"/>
+            <w:tabs>
+              <w:tab w:val="left" w:pos="960"/>
+              <w:tab w:val="right" w:leader="dot" w:pos="9016"/>
+            </w:tabs>
+            <w:rPr>
+              <w:rFonts w:eastAsiaTheme="minorEastAsia"/>
+              <w:noProof/>
+              <w:lang w:eastAsia="en-CH"/>
+            </w:rPr>
+          </w:pPr>
+          <w:hyperlink w:anchor="_Toc228774693" w:history="1">
+            <w:r>
+              <w:rPr>
+                <w:rStyle w:val="Hyperlink"/>
+                <w:noProof/>
+              </w:rPr>
+              <w:t>7.3</w:t>
+            </w:r>
+            <w:r>
+              <w:rPr>
+                <w:rFonts w:eastAsiaTheme="minorEastAsia"/>
+                <w:noProof/>
+                <w:lang w:eastAsia="en-CH"/>
+              </w:rPr>
+              <w:tab/>
+            </w:r>
+            <w:r>
+              <w:rPr>
+                <w:rStyle w:val="Hyperlink"/>
+                <w:noProof/>
+              </w:rPr>
+              <w:t>Possible Future Improvement</w:t>
+            </w:r>
+            <w:r>
+              <w:rPr>
+                <w:noProof/>
+                <w:webHidden/>
+              </w:rPr>
+              <w:tab/>
+            </w:r>
+            <w:r>
+              <w:rPr>
+                <w:noProof/>
+                <w:webHidden/>
+              </w:rPr>
+              <w:fldChar w:fldCharType="begin"/>
+            </w:r>
+            <w:r>
+              <w:rPr>
+                <w:noProof/>
+                <w:webHidden/>
+              </w:rPr>
+              <w:instrText xml:space="preserve"> PAGEREF _Toc228774693 \h </w:instrText>
+            </w:r>
+            <w:r>
+              <w:rPr>
+                <w:noProof/>
+                <w:webHidden/>
+              </w:rPr>
+            </w:r>
+            <w:r>
+              <w:rPr>
+                <w:noProof/>
+                <w:webHidden/>
+              </w:rPr>
+              <w:fldChar w:fldCharType="separate"/>
+            </w:r>
+            <w:r>
+              <w:rPr>
+                <w:noProof/>
+                <w:webHidden/>
+              </w:rPr>
+              <w:t>62</w:t>
+            </w:r>
+            <w:r>
+              <w:rPr>
+                <w:noProof/>
+                <w:webHidden/>
+              </w:rPr>
+              <w:fldChar w:fldCharType="end"/>
+            </w:r>
+          </w:hyperlink>
+        </w:p>
+        <w:p>
+          <w:pPr>
+            <w:pStyle w:val="TOC2"/>
+            <w:tabs>
+              <w:tab w:val="right" w:leader="dot" w:pos="9016"/>
+            </w:tabs>
+            <w:rPr>
+              <w:rFonts w:eastAsiaTheme="minorEastAsia"/>
+              <w:noProof/>
+              <w:lang w:eastAsia="en-CH"/>
+            </w:rPr>
+          </w:pPr>
+          <w:hyperlink w:anchor="_Toc228774694" w:history="1">
+            <w:r>
+              <w:rPr>
+                <w:rStyle w:val="Hyperlink"/>
+                <w:noProof/>
+              </w:rPr>
+              <w:t>7.4 Summary</w:t>
+            </w:r>
+            <w:r>
+              <w:rPr>
+                <w:noProof/>
+                <w:webHidden/>
+              </w:rPr>
+              <w:tab/>
+            </w:r>
+            <w:r>
+              <w:rPr>
+                <w:noProof/>
+                <w:webHidden/>
+              </w:rPr>
+              <w:fldChar w:fldCharType="begin"/>
+            </w:r>
+            <w:r>
+              <w:rPr>
+                <w:noProof/>
+                <w:webHidden/>
+              </w:rPr>
+              <w:instrText xml:space="preserve"> PAGEREF _Toc228774694 \h </w:instrText>
+            </w:r>
+            <w:r>
+              <w:rPr>
+                <w:noProof/>
+                <w:webHidden/>
+              </w:rPr>
+            </w:r>
+            <w:r>
+              <w:rPr>
+                <w:noProof/>
+                <w:webHidden/>
+              </w:rPr>
+              <w:fldChar w:fldCharType="separate"/>
+            </w:r>
+            <w:r>
+              <w:rPr>
+                <w:noProof/>
+                <w:webHidden/>
+              </w:rPr>
+              <w:t>63</w:t>
             </w:r>
             <w:r>
               <w:rPr>
@@ -4655,13 +5455,13 @@
               <w:lang w:eastAsia="en-CH"/>
             </w:rPr>
           </w:pPr>
-          <w:hyperlink w:anchor="_Toc228438136" w:history="1">
+          <w:hyperlink w:anchor="_Toc228774695" w:history="1">
             <w:r>
               <w:rPr>
                 <w:rStyle w:val="Hyperlink"/>
                 <w:noProof/>
               </w:rPr>
-              <w:t>7</w:t>
+              <w:t>8</w:t>
             </w:r>
             <w:r>
               <w:rPr>
@@ -4676,7 +5476,7 @@
                 <w:rStyle w:val="Hyperlink"/>
                 <w:noProof/>
               </w:rPr>
-              <w:t>Evaluate</w:t>
+              <w:t>Appendix</w:t>
             </w:r>
             <w:r>
               <w:rPr>
@@ -4697,7 +5497,7 @@
                 <w:noProof/>
                 <w:webHidden/>
               </w:rPr>
-              <w:instrText xml:space="preserve"> PAGEREF _Toc228438136 \h </w:instrText>
+              <w:instrText xml:space="preserve"> PAGEREF _Toc228774695 \h </w:instrText>
             </w:r>
             <w:r>
               <w:rPr>
@@ -4717,7 +5517,7 @@
                 <w:noProof/>
                 <w:webHidden/>
               </w:rPr>
-              <w:t>54</w:t>
+              <w:t>64</w:t>
             </w:r>
             <w:r>
               <w:rPr>
@@ -4741,13 +5541,13 @@
               <w:lang w:eastAsia="en-CH"/>
             </w:rPr>
           </w:pPr>
-          <w:hyperlink w:anchor="_Toc228438137" w:history="1">
+          <w:hyperlink w:anchor="_Toc228774696" w:history="1">
             <w:r>
               <w:rPr>
                 <w:rStyle w:val="Hyperlink"/>
                 <w:noProof/>
               </w:rPr>
-              <w:t>7.1</w:t>
+              <w:t>8.1</w:t>
             </w:r>
             <w:r>
               <w:rPr>
@@ -4762,7 +5562,7 @@
                 <w:rStyle w:val="Hyperlink"/>
                 <w:noProof/>
               </w:rPr>
-              <w:t>Reflection</w:t>
+              <w:t>Glossary</w:t>
             </w:r>
             <w:r>
               <w:rPr>
@@ -4783,7 +5583,7 @@
                 <w:noProof/>
                 <w:webHidden/>
               </w:rPr>
-              <w:instrText xml:space="preserve"> PAGEREF _Toc228438137 \h </w:instrText>
+              <w:instrText xml:space="preserve"> PAGEREF _Toc228774696 \h </w:instrText>
             </w:r>
             <w:r>
               <w:rPr>
@@ -4803,7 +5603,7 @@
                 <w:noProof/>
                 <w:webHidden/>
               </w:rPr>
-              <w:t>55</w:t>
+              <w:t>64</w:t>
             </w:r>
             <w:r>
               <w:rPr>
@@ -4827,13 +5627,13 @@
               <w:lang w:eastAsia="en-CH"/>
             </w:rPr>
           </w:pPr>
-          <w:hyperlink w:anchor="_Toc228438138" w:history="1">
+          <w:hyperlink w:anchor="_Toc228774697" w:history="1">
             <w:r>
               <w:rPr>
                 <w:rStyle w:val="Hyperlink"/>
                 <w:noProof/>
               </w:rPr>
-              <w:t>7.2</w:t>
+              <w:t>8.2</w:t>
             </w:r>
             <w:r>
               <w:rPr>
@@ -4848,7 +5648,7 @@
                 <w:rStyle w:val="Hyperlink"/>
                 <w:noProof/>
               </w:rPr>
-              <w:t>IPERKA concerns</w:t>
+              <w:t>Bibliography</w:t>
             </w:r>
             <w:r>
               <w:rPr>
@@ -4869,7 +5669,7 @@
                 <w:noProof/>
                 <w:webHidden/>
               </w:rPr>
-              <w:instrText xml:space="preserve"> PAGEREF _Toc228438138 \h </w:instrText>
+              <w:instrText xml:space="preserve"> PAGEREF _Toc228774697 \h </w:instrText>
             </w:r>
             <w:r>
               <w:rPr>
@@ -4889,7 +5689,7 @@
                 <w:noProof/>
                 <w:webHidden/>
               </w:rPr>
-              <w:t>56</w:t>
+              <w:t>65</w:t>
             </w:r>
             <w:r>
               <w:rPr>
@@ -4913,13 +5713,13 @@
               <w:lang w:eastAsia="en-CH"/>
             </w:rPr>
           </w:pPr>
-          <w:hyperlink w:anchor="_Toc228438139" w:history="1">
+          <w:hyperlink w:anchor="_Toc228774698" w:history="1">
             <w:r>
               <w:rPr>
                 <w:rStyle w:val="Hyperlink"/>
                 <w:noProof/>
               </w:rPr>
-              <w:t>7.3</w:t>
+              <w:t>8.3</w:t>
             </w:r>
             <w:r>
               <w:rPr>
@@ -4934,7 +5734,7 @@
                 <w:rStyle w:val="Hyperlink"/>
                 <w:noProof/>
               </w:rPr>
-              <w:t>Possible Future Improvement</w:t>
+              <w:t>Declaration of Independent Work</w:t>
             </w:r>
             <w:r>
               <w:rPr>
@@ -4955,7 +5755,7 @@
                 <w:noProof/>
                 <w:webHidden/>
               </w:rPr>
-              <w:instrText xml:space="preserve"> PAGEREF _Toc228438139 \h </w:instrText>
+              <w:instrText xml:space="preserve"> PAGEREF _Toc228774698 \h </w:instrText>
             </w:r>
             <w:r>
               <w:rPr>
@@ -4975,421 +5775,7 @@
                 <w:noProof/>
                 <w:webHidden/>
               </w:rPr>
-              <w:t>57</w:t>
-            </w:r>
-            <w:r>
-              <w:rPr>
-                <w:noProof/>
-                <w:webHidden/>
-              </w:rPr>
-              <w:fldChar w:fldCharType="end"/>
-            </w:r>
-          </w:hyperlink>
-        </w:p>
-        <w:p>
-          <w:pPr>
-            <w:pStyle w:val="TOC2"/>
-            <w:tabs>
-              <w:tab w:val="right" w:leader="dot" w:pos="9016"/>
-            </w:tabs>
-            <w:rPr>
-              <w:rFonts w:eastAsiaTheme="minorEastAsia"/>
-              <w:noProof/>
-              <w:lang w:eastAsia="en-CH"/>
-            </w:rPr>
-          </w:pPr>
-          <w:hyperlink w:anchor="_Toc228438140" w:history="1">
-            <w:r>
-              <w:rPr>
-                <w:rStyle w:val="Hyperlink"/>
-                <w:noProof/>
-              </w:rPr>
-              <w:t>7.4 Summary</w:t>
-            </w:r>
-            <w:r>
-              <w:rPr>
-                <w:noProof/>
-                <w:webHidden/>
-              </w:rPr>
-              <w:tab/>
-            </w:r>
-            <w:r>
-              <w:rPr>
-                <w:noProof/>
-                <w:webHidden/>
-              </w:rPr>
-              <w:fldChar w:fldCharType="begin"/>
-            </w:r>
-            <w:r>
-              <w:rPr>
-                <w:noProof/>
-                <w:webHidden/>
-              </w:rPr>
-              <w:instrText xml:space="preserve"> PAGEREF _Toc228438140 \h </w:instrText>
-            </w:r>
-            <w:r>
-              <w:rPr>
-                <w:noProof/>
-                <w:webHidden/>
-              </w:rPr>
-            </w:r>
-            <w:r>
-              <w:rPr>
-                <w:noProof/>
-                <w:webHidden/>
-              </w:rPr>
-              <w:fldChar w:fldCharType="separate"/>
-            </w:r>
-            <w:r>
-              <w:rPr>
-                <w:noProof/>
-                <w:webHidden/>
-              </w:rPr>
-              <w:t>58</w:t>
-            </w:r>
-            <w:r>
-              <w:rPr>
-                <w:noProof/>
-                <w:webHidden/>
-              </w:rPr>
-              <w:fldChar w:fldCharType="end"/>
-            </w:r>
-          </w:hyperlink>
-        </w:p>
-        <w:p>
-          <w:pPr>
-            <w:pStyle w:val="TOC1"/>
-            <w:tabs>
-              <w:tab w:val="left" w:pos="480"/>
-              <w:tab w:val="right" w:leader="dot" w:pos="9016"/>
-            </w:tabs>
-            <w:rPr>
-              <w:rFonts w:eastAsiaTheme="minorEastAsia"/>
-              <w:noProof/>
-              <w:lang w:eastAsia="en-CH"/>
-            </w:rPr>
-          </w:pPr>
-          <w:hyperlink w:anchor="_Toc228438141" w:history="1">
-            <w:r>
-              <w:rPr>
-                <w:rStyle w:val="Hyperlink"/>
-                <w:noProof/>
-              </w:rPr>
-              <w:t>8</w:t>
-            </w:r>
-            <w:r>
-              <w:rPr>
-                <w:rFonts w:eastAsiaTheme="minorEastAsia"/>
-                <w:noProof/>
-                <w:lang w:eastAsia="en-CH"/>
-              </w:rPr>
-              <w:tab/>
-            </w:r>
-            <w:r>
-              <w:rPr>
-                <w:rStyle w:val="Hyperlink"/>
-                <w:noProof/>
-              </w:rPr>
-              <w:t>Appendix</w:t>
-            </w:r>
-            <w:r>
-              <w:rPr>
-                <w:noProof/>
-                <w:webHidden/>
-              </w:rPr>
-              <w:tab/>
-            </w:r>
-            <w:r>
-              <w:rPr>
-                <w:noProof/>
-                <w:webHidden/>
-              </w:rPr>
-              <w:fldChar w:fldCharType="begin"/>
-            </w:r>
-            <w:r>
-              <w:rPr>
-                <w:noProof/>
-                <w:webHidden/>
-              </w:rPr>
-              <w:instrText xml:space="preserve"> PAGEREF _Toc228438141 \h </w:instrText>
-            </w:r>
-            <w:r>
-              <w:rPr>
-                <w:noProof/>
-                <w:webHidden/>
-              </w:rPr>
-            </w:r>
-            <w:r>
-              <w:rPr>
-                <w:noProof/>
-                <w:webHidden/>
-              </w:rPr>
-              <w:fldChar w:fldCharType="separate"/>
-            </w:r>
-            <w:r>
-              <w:rPr>
-                <w:noProof/>
-                <w:webHidden/>
-              </w:rPr>
-              <w:t>59</w:t>
-            </w:r>
-            <w:r>
-              <w:rPr>
-                <w:noProof/>
-                <w:webHidden/>
-              </w:rPr>
-              <w:fldChar w:fldCharType="end"/>
-            </w:r>
-          </w:hyperlink>
-        </w:p>
-        <w:p>
-          <w:pPr>
-            <w:pStyle w:val="TOC2"/>
-            <w:tabs>
-              <w:tab w:val="left" w:pos="960"/>
-              <w:tab w:val="right" w:leader="dot" w:pos="9016"/>
-            </w:tabs>
-            <w:rPr>
-              <w:rFonts w:eastAsiaTheme="minorEastAsia"/>
-              <w:noProof/>
-              <w:lang w:eastAsia="en-CH"/>
-            </w:rPr>
-          </w:pPr>
-          <w:hyperlink w:anchor="_Toc228438142" w:history="1">
-            <w:r>
-              <w:rPr>
-                <w:rStyle w:val="Hyperlink"/>
-                <w:noProof/>
-              </w:rPr>
-              <w:t>8.1</w:t>
-            </w:r>
-            <w:r>
-              <w:rPr>
-                <w:rFonts w:eastAsiaTheme="minorEastAsia"/>
-                <w:noProof/>
-                <w:lang w:eastAsia="en-CH"/>
-              </w:rPr>
-              <w:tab/>
-            </w:r>
-            <w:r>
-              <w:rPr>
-                <w:rStyle w:val="Hyperlink"/>
-                <w:noProof/>
-              </w:rPr>
-              <w:t>Glossary</w:t>
-            </w:r>
-            <w:r>
-              <w:rPr>
-                <w:noProof/>
-                <w:webHidden/>
-              </w:rPr>
-              <w:tab/>
-            </w:r>
-            <w:r>
-              <w:rPr>
-                <w:noProof/>
-                <w:webHidden/>
-              </w:rPr>
-              <w:fldChar w:fldCharType="begin"/>
-            </w:r>
-            <w:r>
-              <w:rPr>
-                <w:noProof/>
-                <w:webHidden/>
-              </w:rPr>
-              <w:instrText xml:space="preserve"> PAGEREF _Toc228438142 \h </w:instrText>
-            </w:r>
-            <w:r>
-              <w:rPr>
-                <w:noProof/>
-                <w:webHidden/>
-              </w:rPr>
-            </w:r>
-            <w:r>
-              <w:rPr>
-                <w:noProof/>
-                <w:webHidden/>
-              </w:rPr>
-              <w:fldChar w:fldCharType="separate"/>
-            </w:r>
-            <w:r>
-              <w:rPr>
-                <w:noProof/>
-                <w:webHidden/>
-              </w:rPr>
-              <w:t>59</w:t>
-            </w:r>
-            <w:r>
-              <w:rPr>
-                <w:noProof/>
-                <w:webHidden/>
-              </w:rPr>
-              <w:fldChar w:fldCharType="end"/>
-            </w:r>
-          </w:hyperlink>
-        </w:p>
-        <w:p>
-          <w:pPr>
-            <w:pStyle w:val="TOC2"/>
-            <w:tabs>
-              <w:tab w:val="left" w:pos="960"/>
-              <w:tab w:val="right" w:leader="dot" w:pos="9016"/>
-            </w:tabs>
-            <w:rPr>
-              <w:rFonts w:eastAsiaTheme="minorEastAsia"/>
-              <w:noProof/>
-              <w:lang w:eastAsia="en-CH"/>
-            </w:rPr>
-          </w:pPr>
-          <w:hyperlink w:anchor="_Toc228438143" w:history="1">
-            <w:r>
-              <w:rPr>
-                <w:rStyle w:val="Hyperlink"/>
-                <w:noProof/>
-              </w:rPr>
-              <w:t>8.2</w:t>
-            </w:r>
-            <w:r>
-              <w:rPr>
-                <w:rFonts w:eastAsiaTheme="minorEastAsia"/>
-                <w:noProof/>
-                <w:lang w:eastAsia="en-CH"/>
-              </w:rPr>
-              <w:tab/>
-            </w:r>
-            <w:r>
-              <w:rPr>
-                <w:rStyle w:val="Hyperlink"/>
-                <w:noProof/>
-              </w:rPr>
-              <w:t>Bibliography</w:t>
-            </w:r>
-            <w:r>
-              <w:rPr>
-                <w:noProof/>
-                <w:webHidden/>
-              </w:rPr>
-              <w:tab/>
-            </w:r>
-            <w:r>
-              <w:rPr>
-                <w:noProof/>
-                <w:webHidden/>
-              </w:rPr>
-              <w:fldChar w:fldCharType="begin"/>
-            </w:r>
-            <w:r>
-              <w:rPr>
-                <w:noProof/>
-                <w:webHidden/>
-              </w:rPr>
-              <w:instrText xml:space="preserve"> PAGEREF _Toc228438143 \h </w:instrText>
-            </w:r>
-            <w:r>
-              <w:rPr>
-                <w:noProof/>
-                <w:webHidden/>
-              </w:rPr>
-            </w:r>
-            <w:r>
-              <w:rPr>
-                <w:noProof/>
-                <w:webHidden/>
-              </w:rPr>
-              <w:fldChar w:fldCharType="separate"/>
-            </w:r>
-            <w:r>
-              <w:rPr>
-                <w:noProof/>
-                <w:webHidden/>
-              </w:rPr>
-              <w:t>60</w:t>
-            </w:r>
-            <w:r>
-              <w:rPr>
-                <w:noProof/>
-                <w:webHidden/>
-              </w:rPr>
-              <w:fldChar w:fldCharType="end"/>
-            </w:r>
-          </w:hyperlink>
-        </w:p>
-        <w:p>
-          <w:pPr>
-            <w:pStyle w:val="TOC2"/>
-            <w:tabs>
-              <w:tab w:val="left" w:pos="960"/>
-              <w:tab w:val="right" w:leader="dot" w:pos="9016"/>
-            </w:tabs>
-            <w:rPr>
-              <w:rFonts w:eastAsiaTheme="minorEastAsia"/>
-              <w:noProof/>
-              <w:lang w:eastAsia="en-CH"/>
-            </w:rPr>
-          </w:pPr>
-          <w:hyperlink w:anchor="_Toc228438144" w:history="1">
-            <w:r>
-              <w:rPr>
-                <w:rStyle w:val="Hyperlink"/>
-                <w:noProof/>
-              </w:rPr>
-              <w:t>8.3</w:t>
-            </w:r>
-            <w:r>
-              <w:rPr>
-                <w:rFonts w:eastAsiaTheme="minorEastAsia"/>
-                <w:noProof/>
-                <w:lang w:eastAsia="en-CH"/>
-              </w:rPr>
-              <w:tab/>
-            </w:r>
-            <w:r>
-              <w:rPr>
-                <w:rStyle w:val="Hyperlink"/>
-                <w:noProof/>
-              </w:rPr>
-              <w:t>Declaration of Independent Work</w:t>
-            </w:r>
-            <w:r>
-              <w:rPr>
-                <w:noProof/>
-                <w:webHidden/>
-              </w:rPr>
-              <w:tab/>
-            </w:r>
-            <w:r>
-              <w:rPr>
-                <w:noProof/>
-                <w:webHidden/>
-              </w:rPr>
-              <w:fldChar w:fldCharType="begin"/>
-            </w:r>
-            <w:r>
-              <w:rPr>
-                <w:noProof/>
-                <w:webHidden/>
-              </w:rPr>
-              <w:instrText xml:space="preserve"> PAGEREF _Toc228438144 \h </w:instrText>
-            </w:r>
-            <w:r>
-              <w:rPr>
-                <w:noProof/>
-                <w:webHidden/>
-              </w:rPr>
-            </w:r>
-            <w:r>
-              <w:rPr>
-                <w:noProof/>
-                <w:webHidden/>
-              </w:rPr>
-              <w:fldChar w:fldCharType="separate"/>
-            </w:r>
-            <w:r>
-              <w:rPr>
-                <w:noProof/>
-                <w:webHidden/>
-              </w:rPr>
-              <w:t>60</w:t>
+              <w:t>65</w:t>
             </w:r>
             <w:r>
               <w:rPr>
@@ -5440,7 +5826,7 @@
           <w:szCs w:val="144"/>
         </w:rPr>
       </w:pPr>
-      <w:bookmarkStart w:id="0" w:name="_Toc228438082"/>
+      <w:bookmarkStart w:id="0" w:name="_Toc228774630"/>
       <w:r>
         <w:rPr>
           <w:sz w:val="144"/>
@@ -5469,7 +5855,7 @@
         <w:pStyle w:val="Heading1"/>
         <w:jc w:val="both"/>
       </w:pPr>
-      <w:bookmarkStart w:id="1" w:name="_Toc228438083"/>
+      <w:bookmarkStart w:id="1" w:name="_Toc228774631"/>
       <w:r>
         <w:lastRenderedPageBreak/>
         <w:t>1.1</w:t>
@@ -5604,7 +5990,7 @@
         <w:pStyle w:val="Heading2"/>
         <w:jc w:val="both"/>
       </w:pPr>
-      <w:bookmarkStart w:id="2" w:name="_Toc228438084"/>
+      <w:bookmarkStart w:id="2" w:name="_Toc228774632"/>
       <w:r>
         <w:lastRenderedPageBreak/>
         <w:t>1.2</w:t>
@@ -6290,7 +6676,7 @@
         <w:pStyle w:val="Heading2"/>
         <w:jc w:val="both"/>
       </w:pPr>
-      <w:bookmarkStart w:id="3" w:name="_Toc228438085"/>
+      <w:bookmarkStart w:id="3" w:name="_Toc228774633"/>
       <w:r>
         <w:lastRenderedPageBreak/>
         <w:t>1.3</w:t>
@@ -6565,7 +6951,7 @@
         <w:pStyle w:val="Heading2"/>
         <w:jc w:val="both"/>
       </w:pPr>
-      <w:bookmarkStart w:id="4" w:name="_Toc228438086"/>
+      <w:bookmarkStart w:id="4" w:name="_Toc228774634"/>
       <w:r>
         <w:lastRenderedPageBreak/>
         <w:t>1.4</w:t>
@@ -6740,7 +7126,7 @@
       <w:pPr>
         <w:pStyle w:val="Heading3"/>
       </w:pPr>
-      <w:bookmarkStart w:id="5" w:name="_Toc228438087"/>
+      <w:bookmarkStart w:id="5" w:name="_Toc228774635"/>
       <w:r>
         <w:lastRenderedPageBreak/>
         <w:t>1.3.1</w:t>
@@ -7873,7 +8259,7 @@
         <w:pStyle w:val="Heading2"/>
         <w:jc w:val="both"/>
       </w:pPr>
-      <w:bookmarkStart w:id="6" w:name="_Toc228438088"/>
+      <w:bookmarkStart w:id="6" w:name="_Toc228774636"/>
       <w:r>
         <w:t>1.5</w:t>
       </w:r>
@@ -7892,7 +8278,7 @@
         <w:jc w:val="both"/>
       </w:pPr>
       <w:bookmarkStart w:id="7" w:name="_Toc222128634"/>
-      <w:bookmarkStart w:id="8" w:name="_Toc228438089"/>
+      <w:bookmarkStart w:id="8" w:name="_Toc228774637"/>
       <w:r>
         <w:t>1.5.1</w:t>
       </w:r>
@@ -8354,7 +8740,7 @@
         <w:pStyle w:val="Heading3"/>
         <w:jc w:val="both"/>
       </w:pPr>
-      <w:bookmarkStart w:id="9" w:name="_Toc228438090"/>
+      <w:bookmarkStart w:id="9" w:name="_Toc228774638"/>
       <w:r>
         <w:lastRenderedPageBreak/>
         <w:t>1.5.2</w:t>
@@ -8838,7 +9224,7 @@
         <w:pStyle w:val="Heading3"/>
         <w:jc w:val="both"/>
       </w:pPr>
-      <w:bookmarkStart w:id="10" w:name="_Toc228438091"/>
+      <w:bookmarkStart w:id="10" w:name="_Toc228774639"/>
       <w:r>
         <w:lastRenderedPageBreak/>
         <w:t>1.5.3</w:t>
@@ -9264,7 +9650,7 @@
         <w:pStyle w:val="Heading3"/>
         <w:jc w:val="both"/>
       </w:pPr>
-      <w:bookmarkStart w:id="11" w:name="_Toc228438092"/>
+      <w:bookmarkStart w:id="11" w:name="_Toc228774640"/>
       <w:r>
         <w:lastRenderedPageBreak/>
         <w:t>1.5.4</w:t>
@@ -9579,9 +9965,6 @@
             <w:pPr>
               <w:ind w:right="278"/>
               <w:jc w:val="both"/>
-              <w:rPr>
-                <w:lang w:val="en-CH"/>
-              </w:rPr>
             </w:pPr>
             <w:r>
               <w:t xml:space="preserve">I was happy with my efforts today, being able to work on </w:t>
@@ -9628,7 +10011,7 @@
         <w:pStyle w:val="Heading3"/>
         <w:jc w:val="both"/>
       </w:pPr>
-      <w:bookmarkStart w:id="12" w:name="_Toc228438093"/>
+      <w:bookmarkStart w:id="12" w:name="_Toc228774641"/>
       <w:r>
         <w:lastRenderedPageBreak/>
         <w:t>1.5.5</w:t>
@@ -9949,7 +10332,7 @@
         <w:pStyle w:val="Heading3"/>
         <w:jc w:val="both"/>
       </w:pPr>
-      <w:bookmarkStart w:id="13" w:name="_Toc228438094"/>
+      <w:bookmarkStart w:id="13" w:name="_Toc228774642"/>
       <w:r>
         <w:lastRenderedPageBreak/>
         <w:t>1.5.6</w:t>
@@ -10250,7 +10633,7 @@
         </w:rPr>
         <w:br w:type="page"/>
       </w:r>
-      <w:bookmarkStart w:id="14" w:name="_Toc228438095"/>
+      <w:bookmarkStart w:id="14" w:name="_Toc228774643"/>
       <w:r>
         <w:lastRenderedPageBreak/>
         <w:t>1.5.7</w:t>
@@ -10566,7 +10949,7 @@
         </w:rPr>
         <w:br w:type="page"/>
       </w:r>
-      <w:bookmarkStart w:id="15" w:name="_Toc228438096"/>
+      <w:bookmarkStart w:id="15" w:name="_Toc228774644"/>
       <w:r>
         <w:lastRenderedPageBreak/>
         <w:t>1.5.8</w:t>
@@ -10889,7 +11272,7 @@
         <w:pStyle w:val="Heading3"/>
         <w:jc w:val="both"/>
       </w:pPr>
-      <w:bookmarkStart w:id="16" w:name="_Toc228438097"/>
+      <w:bookmarkStart w:id="16" w:name="_Toc228774645"/>
       <w:r>
         <w:lastRenderedPageBreak/>
         <w:t>1.5.</w:t>
@@ -11218,7 +11601,7 @@
         <w:pStyle w:val="Heading3"/>
         <w:jc w:val="both"/>
       </w:pPr>
-      <w:bookmarkStart w:id="17" w:name="_Toc228438098"/>
+      <w:bookmarkStart w:id="17" w:name="_Toc228774646"/>
       <w:r>
         <w:lastRenderedPageBreak/>
         <w:t>1.5.</w:t>
@@ -11543,7 +11926,7 @@
       <w:pPr>
         <w:pStyle w:val="Heading2"/>
       </w:pPr>
-      <w:bookmarkStart w:id="18" w:name="_Toc228438099"/>
+      <w:bookmarkStart w:id="18" w:name="_Toc228774647"/>
       <w:r>
         <w:lastRenderedPageBreak/>
         <w:t>1.6 Personal Conclusion</w:t>
@@ -11851,7 +12234,7 @@
           <w:szCs w:val="144"/>
         </w:rPr>
       </w:pPr>
-      <w:bookmarkStart w:id="19" w:name="_Toc228438100"/>
+      <w:bookmarkStart w:id="19" w:name="_Toc228774648"/>
       <w:r>
         <w:rPr>
           <w:sz w:val="144"/>
@@ -11865,7 +12248,7 @@
       <w:pPr>
         <w:pStyle w:val="Heading2"/>
       </w:pPr>
-      <w:bookmarkStart w:id="20" w:name="_Toc228438101"/>
+      <w:bookmarkStart w:id="20" w:name="_Toc228774649"/>
       <w:r>
         <w:t>2.0</w:t>
       </w:r>
@@ -11969,7 +12352,7 @@
         <w:pStyle w:val="Heading1"/>
         <w:jc w:val="both"/>
       </w:pPr>
-      <w:bookmarkStart w:id="21" w:name="_Toc228438102"/>
+      <w:bookmarkStart w:id="21" w:name="_Toc228774650"/>
       <w:r>
         <w:lastRenderedPageBreak/>
         <w:t>2</w:t>
@@ -11984,7 +12367,7 @@
       <w:pPr>
         <w:pStyle w:val="Heading2"/>
       </w:pPr>
-      <w:bookmarkStart w:id="22" w:name="_Toc228438103"/>
+      <w:bookmarkStart w:id="22" w:name="_Toc228774651"/>
       <w:r>
         <w:t>2.1 Initial situation</w:t>
       </w:r>
@@ -12020,7 +12403,7 @@
       <w:pPr>
         <w:pStyle w:val="Heading2"/>
       </w:pPr>
-      <w:bookmarkStart w:id="23" w:name="_Toc228438104"/>
+      <w:bookmarkStart w:id="23" w:name="_Toc228774652"/>
       <w:r>
         <w:t>2.2 Objective</w:t>
       </w:r>
@@ -12054,7 +12437,7 @@
       <w:pPr>
         <w:pStyle w:val="Heading2"/>
       </w:pPr>
-      <w:bookmarkStart w:id="24" w:name="_Toc228438105"/>
+      <w:bookmarkStart w:id="24" w:name="_Toc228774653"/>
       <w:r>
         <w:t>2.3 Non-Functional Requirements</w:t>
       </w:r>
@@ -12122,7 +12505,7 @@
       <w:pPr>
         <w:pStyle w:val="Heading2"/>
       </w:pPr>
-      <w:bookmarkStart w:id="25" w:name="_Toc228438106"/>
+      <w:bookmarkStart w:id="25" w:name="_Toc228774654"/>
       <w:r>
         <w:lastRenderedPageBreak/>
         <w:t>2.4 Functional Requirements</w:t>
@@ -12368,7 +12751,7 @@
       <w:pPr>
         <w:pStyle w:val="Heading2"/>
       </w:pPr>
-      <w:bookmarkStart w:id="26" w:name="_Toc228438107"/>
+      <w:bookmarkStart w:id="26" w:name="_Toc228774655"/>
       <w:r>
         <w:t>2.5 Technical Specifications</w:t>
       </w:r>
@@ -12511,7 +12894,7 @@
         <w:pStyle w:val="Heading2"/>
         <w:jc w:val="both"/>
       </w:pPr>
-      <w:bookmarkStart w:id="27" w:name="_Toc228438108"/>
+      <w:bookmarkStart w:id="27" w:name="_Toc228774656"/>
       <w:r>
         <w:lastRenderedPageBreak/>
         <w:t xml:space="preserve">2.6 </w:t>
@@ -12607,7 +12990,7 @@
         <w:pStyle w:val="Heading3"/>
         <w:jc w:val="both"/>
       </w:pPr>
-      <w:bookmarkStart w:id="28" w:name="_Toc228438109"/>
+      <w:bookmarkStart w:id="28" w:name="_Toc228774657"/>
       <w:r>
         <w:t>2.6.1</w:t>
       </w:r>
@@ -12772,7 +13155,7 @@
       <w:r>
         <w:br w:type="page"/>
       </w:r>
-      <w:bookmarkStart w:id="29" w:name="_Toc228438110"/>
+      <w:bookmarkStart w:id="29" w:name="_Toc228774658"/>
       <w:r>
         <w:lastRenderedPageBreak/>
         <w:t>2.6.2</w:t>
@@ -12903,7 +13286,7 @@
         <w:pStyle w:val="Heading3"/>
         <w:jc w:val="both"/>
       </w:pPr>
-      <w:bookmarkStart w:id="30" w:name="_Toc228438111"/>
+      <w:bookmarkStart w:id="30" w:name="_Toc228774659"/>
       <w:r>
         <w:t>2.6.3</w:t>
       </w:r>
@@ -12975,7 +13358,7 @@
         <w:pStyle w:val="Heading3"/>
         <w:jc w:val="both"/>
       </w:pPr>
-      <w:bookmarkStart w:id="31" w:name="_Toc228438112"/>
+      <w:bookmarkStart w:id="31" w:name="_Toc228774660"/>
       <w:r>
         <w:t>2.6.4 Fetch</w:t>
       </w:r>
@@ -13051,7 +13434,7 @@
         <w:pStyle w:val="Heading2"/>
         <w:jc w:val="both"/>
       </w:pPr>
-      <w:bookmarkStart w:id="32" w:name="_Toc228438113"/>
+      <w:bookmarkStart w:id="32" w:name="_Toc228774661"/>
       <w:r>
         <w:lastRenderedPageBreak/>
         <w:t>2.</w:t>
@@ -13251,7 +13634,7 @@
         <w:pStyle w:val="Heading1"/>
         <w:jc w:val="both"/>
       </w:pPr>
-      <w:bookmarkStart w:id="33" w:name="_Toc228438114"/>
+      <w:bookmarkStart w:id="33" w:name="_Toc228774662"/>
       <w:r>
         <w:lastRenderedPageBreak/>
         <w:t>3</w:t>
@@ -13267,7 +13650,7 @@
         <w:pStyle w:val="Heading2"/>
         <w:jc w:val="both"/>
       </w:pPr>
-      <w:bookmarkStart w:id="34" w:name="_Toc228438115"/>
+      <w:bookmarkStart w:id="34" w:name="_Toc228774663"/>
       <w:r>
         <w:t>3.1</w:t>
       </w:r>
@@ -13318,10 +13701,10 @@
           <w:noProof/>
         </w:rPr>
         <w:drawing>
-          <wp:inline distT="0" distB="0" distL="0" distR="0" wp14:anchorId="45BAC51E" wp14:editId="053F9C3F">
-            <wp:extent cx="5731510" cy="5213350"/>
-            <wp:effectExtent l="19050" t="19050" r="21590" b="25400"/>
-            <wp:docPr id="811313679" name="Picture 2"/>
+          <wp:inline distT="0" distB="0" distL="0" distR="0" wp14:anchorId="6E8E737F" wp14:editId="32FF2E3A">
+            <wp:extent cx="5731510" cy="5455920"/>
+            <wp:effectExtent l="19050" t="19050" r="21590" b="11430"/>
+            <wp:docPr id="1733368279" name="Picture 1"/>
             <wp:cNvGraphicFramePr>
               <a:graphicFrameLocks xmlns:a="http://schemas.openxmlformats.org/drawingml/2006/main" noChangeAspect="1"/>
             </wp:cNvGraphicFramePr>
@@ -13329,7 +13712,7 @@
               <a:graphicData uri="http://schemas.openxmlformats.org/drawingml/2006/picture">
                 <pic:pic xmlns:pic="http://schemas.openxmlformats.org/drawingml/2006/picture">
                   <pic:nvPicPr>
-                    <pic:cNvPr id="0" name="Picture 2"/>
+                    <pic:cNvPr id="0" name="Picture 1"/>
                     <pic:cNvPicPr>
                       <a:picLocks noChangeAspect="1" noChangeArrowheads="1"/>
                     </pic:cNvPicPr>
@@ -13350,7 +13733,7 @@
                   <pic:spPr bwMode="auto">
                     <a:xfrm>
                       <a:off x="0" y="0"/>
-                      <a:ext cx="5731510" cy="5213350"/>
+                      <a:ext cx="5731510" cy="5455920"/>
                     </a:xfrm>
                     <a:prstGeom prst="rect">
                       <a:avLst/>
@@ -13358,7 +13741,7 @@
                     <a:noFill/>
                     <a:ln>
                       <a:solidFill>
-                        <a:schemeClr val="tx1"/>
+                        <a:schemeClr val="accent1"/>
                       </a:solidFill>
                     </a:ln>
                   </pic:spPr>
@@ -13388,13 +13771,15 @@
         <w:pStyle w:val="Heading2"/>
         <w:jc w:val="both"/>
       </w:pPr>
-      <w:bookmarkStart w:id="35" w:name="_Toc228438116"/>
+      <w:bookmarkStart w:id="35" w:name="_Toc228774664"/>
       <w:r>
         <w:lastRenderedPageBreak/>
         <w:t>3.2</w:t>
       </w:r>
       <w:r>
         <w:tab/>
+      </w:r>
+      <w:r>
         <w:t>ERM Model</w:t>
       </w:r>
       <w:bookmarkEnd w:id="35"/>
@@ -13479,26 +13864,26 @@
           <w:noProof/>
         </w:rPr>
         <w:drawing>
-          <wp:anchor distT="0" distB="0" distL="114300" distR="114300" simplePos="0" relativeHeight="251660288" behindDoc="1" locked="0" layoutInCell="1" allowOverlap="1" wp14:anchorId="04B1AA3D" wp14:editId="2F7BA7BD">
+          <wp:anchor distT="0" distB="0" distL="114300" distR="114300" simplePos="0" relativeHeight="251658752" behindDoc="0" locked="0" layoutInCell="1" allowOverlap="1" wp14:anchorId="2DEACF7D" wp14:editId="580A6B80">
             <wp:simplePos x="0" y="0"/>
             <wp:positionH relativeFrom="column">
-              <wp:posOffset>2586681</wp:posOffset>
+              <wp:posOffset>3208475</wp:posOffset>
             </wp:positionH>
             <wp:positionV relativeFrom="paragraph">
-              <wp:posOffset>5338</wp:posOffset>
+              <wp:posOffset>899</wp:posOffset>
             </wp:positionV>
-            <wp:extent cx="3344545" cy="6392545"/>
-            <wp:effectExtent l="0" t="0" r="8255" b="8255"/>
-            <wp:wrapTight wrapText="bothSides">
+            <wp:extent cx="2628900" cy="5020310"/>
+            <wp:effectExtent l="0" t="0" r="0" b="8890"/>
+            <wp:wrapThrough wrapText="bothSides">
               <wp:wrapPolygon edited="0">
                 <wp:start x="0" y="0"/>
-                <wp:lineTo x="0" y="21564"/>
-                <wp:lineTo x="21530" y="21564"/>
-                <wp:lineTo x="21530" y="0"/>
+                <wp:lineTo x="0" y="21556"/>
+                <wp:lineTo x="21443" y="21556"/>
+                <wp:lineTo x="21443" y="0"/>
                 <wp:lineTo x="0" y="0"/>
               </wp:wrapPolygon>
-            </wp:wrapTight>
-            <wp:docPr id="2037833714" name="Picture 5"/>
+            </wp:wrapThrough>
+            <wp:docPr id="1344919232" name="Picture 1"/>
             <wp:cNvGraphicFramePr>
               <a:graphicFrameLocks xmlns:a="http://schemas.openxmlformats.org/drawingml/2006/main" noChangeAspect="1"/>
             </wp:cNvGraphicFramePr>
@@ -13506,7 +13891,7 @@
               <a:graphicData uri="http://schemas.openxmlformats.org/drawingml/2006/picture">
                 <pic:pic xmlns:pic="http://schemas.openxmlformats.org/drawingml/2006/picture">
                   <pic:nvPicPr>
-                    <pic:cNvPr id="0" name="Picture 17"/>
+                    <pic:cNvPr id="0" name="Picture 1"/>
                     <pic:cNvPicPr>
                       <a:picLocks noChangeAspect="1" noChangeArrowheads="1"/>
                     </pic:cNvPicPr>
@@ -13527,7 +13912,7 @@
                   <pic:spPr bwMode="auto">
                     <a:xfrm>
                       <a:off x="0" y="0"/>
-                      <a:ext cx="3344545" cy="6392545"/>
+                      <a:ext cx="2628900" cy="5020310"/>
                     </a:xfrm>
                     <a:prstGeom prst="rect">
                       <a:avLst/>
@@ -13540,6 +13925,12 @@
                 </pic:pic>
               </a:graphicData>
             </a:graphic>
+            <wp14:sizeRelH relativeFrom="margin">
+              <wp14:pctWidth>0</wp14:pctWidth>
+            </wp14:sizeRelH>
+            <wp14:sizeRelV relativeFrom="margin">
+              <wp14:pctHeight>0</wp14:pctHeight>
+            </wp14:sizeRelV>
           </wp:anchor>
         </w:drawing>
       </w:r>
@@ -13624,9 +14015,8 @@
           <w:rFonts w:eastAsiaTheme="minorHAnsi"/>
         </w:rPr>
       </w:pPr>
-      <w:bookmarkStart w:id="36" w:name="_Toc228438117"/>
-      <w:r>
-        <w:lastRenderedPageBreak/>
+      <w:bookmarkStart w:id="36" w:name="_Toc228774665"/>
+      <w:r>
         <w:t>3.4</w:t>
       </w:r>
       <w:r>
@@ -13682,7 +14072,11 @@
         <w:t xml:space="preserve"> was very </w:t>
       </w:r>
       <w:r>
-        <w:t>useful in that it helped me internalise the structure that I was going to have to build later on during the realisation step</w:t>
+        <w:t xml:space="preserve">useful in that it helped </w:t>
+      </w:r>
+      <w:r>
+        <w:lastRenderedPageBreak/>
+        <w:t>me internalise the structure that I was going to have to build later on during the realisation step</w:t>
       </w:r>
       <w:r>
         <w:t>, enabling a clear understanding of its dependencies before development began.</w:t>
@@ -13742,7 +14136,7 @@
       <w:pPr>
         <w:pStyle w:val="Heading2"/>
       </w:pPr>
-      <w:bookmarkStart w:id="37" w:name="_Toc228438118"/>
+      <w:bookmarkStart w:id="37" w:name="_Toc228774666"/>
       <w:r>
         <w:lastRenderedPageBreak/>
         <w:t>3.5 Context Diagram</w:t>
@@ -13772,7 +14166,7 @@
           <w:noProof/>
         </w:rPr>
         <w:drawing>
-          <wp:anchor distT="0" distB="0" distL="114300" distR="114300" simplePos="0" relativeHeight="251659264" behindDoc="1" locked="0" layoutInCell="1" allowOverlap="1" wp14:anchorId="3585841C" wp14:editId="10504BC5">
+          <wp:anchor distT="0" distB="0" distL="114300" distR="114300" simplePos="0" relativeHeight="251659264" behindDoc="1" locked="0" layoutInCell="1" allowOverlap="1" wp14:anchorId="3585841C" wp14:editId="281CDB5C">
             <wp:simplePos x="0" y="0"/>
             <wp:positionH relativeFrom="margin">
               <wp:align>right</wp:align>
@@ -14097,7 +14491,7 @@
       <w:pPr>
         <w:pStyle w:val="Heading2"/>
       </w:pPr>
-      <w:bookmarkStart w:id="38" w:name="_Toc228438119"/>
+      <w:bookmarkStart w:id="38" w:name="_Toc228774667"/>
       <w:r>
         <w:lastRenderedPageBreak/>
         <w:t xml:space="preserve">3.6 </w:t>
@@ -14322,7 +14716,7 @@
       <w:pPr>
         <w:pStyle w:val="Heading2"/>
       </w:pPr>
-      <w:bookmarkStart w:id="39" w:name="_Toc228438120"/>
+      <w:bookmarkStart w:id="39" w:name="_Toc228774668"/>
       <w:r>
         <w:lastRenderedPageBreak/>
         <w:t>3.7 Test Plan/Cases</w:t>
@@ -17267,7 +17661,7 @@
       <w:pPr>
         <w:pStyle w:val="Heading1"/>
       </w:pPr>
-      <w:bookmarkStart w:id="40" w:name="_Toc228438121"/>
+      <w:bookmarkStart w:id="40" w:name="_Toc228774669"/>
       <w:r>
         <w:lastRenderedPageBreak/>
         <w:t>4</w:t>
@@ -17314,7 +17708,7 @@
         <w:pStyle w:val="Heading2"/>
         <w:jc w:val="both"/>
       </w:pPr>
-      <w:bookmarkStart w:id="41" w:name="_Toc228438122"/>
+      <w:bookmarkStart w:id="41" w:name="_Toc228774670"/>
       <w:r>
         <w:t>4.</w:t>
       </w:r>
@@ -18978,7 +19372,7 @@
         <w:pStyle w:val="Heading2"/>
         <w:jc w:val="both"/>
       </w:pPr>
-      <w:bookmarkStart w:id="42" w:name="_Toc228438123"/>
+      <w:bookmarkStart w:id="42" w:name="_Toc228774671"/>
       <w:r>
         <w:t>4.</w:t>
       </w:r>
@@ -20668,7 +21062,7 @@
         <w:pStyle w:val="Heading2"/>
         <w:jc w:val="both"/>
       </w:pPr>
-      <w:bookmarkStart w:id="43" w:name="_Toc228438124"/>
+      <w:bookmarkStart w:id="43" w:name="_Toc228774672"/>
       <w:r>
         <w:lastRenderedPageBreak/>
         <w:t>4.</w:t>
@@ -21849,7 +22243,7 @@
       <w:pPr>
         <w:pStyle w:val="Heading2"/>
       </w:pPr>
-      <w:bookmarkStart w:id="44" w:name="_Toc228438125"/>
+      <w:bookmarkStart w:id="44" w:name="_Toc228774673"/>
       <w:r>
         <w:lastRenderedPageBreak/>
         <w:t>4.4 Merge &amp; Deactivation Logic</w:t>
@@ -23043,7 +23437,7 @@
       <w:pPr>
         <w:pStyle w:val="Heading2"/>
       </w:pPr>
-      <w:bookmarkStart w:id="45" w:name="_Toc228438126"/>
+      <w:bookmarkStart w:id="45" w:name="_Toc228774674"/>
       <w:r>
         <w:lastRenderedPageBreak/>
         <w:t>4.5 UI / UX Wireframe</w:t>
@@ -24399,7 +24793,7 @@
         <w:pStyle w:val="Heading1"/>
         <w:jc w:val="both"/>
       </w:pPr>
-      <w:bookmarkStart w:id="46" w:name="_Toc228438127"/>
+      <w:bookmarkStart w:id="46" w:name="_Toc228774675"/>
       <w:r>
         <w:lastRenderedPageBreak/>
         <w:t>5</w:t>
@@ -24468,7 +24862,7 @@
       <w:pPr>
         <w:pStyle w:val="Heading2"/>
       </w:pPr>
-      <w:bookmarkStart w:id="47" w:name="_Toc228438128"/>
+      <w:bookmarkStart w:id="47" w:name="_Toc228774676"/>
       <w:r>
         <w:lastRenderedPageBreak/>
         <w:t>5.1</w:t>
@@ -24496,7 +24890,7 @@
       <w:pPr>
         <w:pStyle w:val="Heading3"/>
       </w:pPr>
-      <w:bookmarkStart w:id="48" w:name="_Toc228438129"/>
+      <w:bookmarkStart w:id="48" w:name="_Toc228774677"/>
       <w:r>
         <w:t>5.1.1 Entities</w:t>
       </w:r>
@@ -24647,7 +25041,7 @@
       <w:pPr>
         <w:pStyle w:val="Heading3"/>
       </w:pPr>
-      <w:bookmarkStart w:id="49" w:name="_Toc228438130"/>
+      <w:bookmarkStart w:id="49" w:name="_Toc228774678"/>
       <w:r>
         <w:lastRenderedPageBreak/>
         <w:t>5.1.2 Polymorphic Lookup</w:t>
@@ -24667,7 +25061,13 @@
       </w:r>
       <w:proofErr w:type="spellEnd"/>
       <w:r>
-        <w:t xml:space="preserve"> was utilized. Specifically, the Polymorphic Lookup Manager plugin was employed to generate the polymorphic lookup field.</w:t>
+        <w:t xml:space="preserve"> was utilized. Specifically, the Polymorphic Lookup Manager was </w:t>
+      </w:r>
+      <w:r>
+        <w:t xml:space="preserve">used </w:t>
+      </w:r>
+      <w:r>
+        <w:t>to generate the polymorphic lookup field.</w:t>
       </w:r>
     </w:p>
     <w:p>
@@ -24816,6 +25216,7 @@
       <w:pPr>
         <w:pStyle w:val="Heading2"/>
       </w:pPr>
+      <w:bookmarkStart w:id="50" w:name="_Toc228774679"/>
       <w:r>
         <w:t>5.2</w:t>
       </w:r>
@@ -24825,6 +25226,7 @@
       <w:r>
         <w:t>Configure Model Driven App</w:t>
       </w:r>
+      <w:bookmarkEnd w:id="50"/>
     </w:p>
     <w:p>
       <w:r>
@@ -24967,6 +25369,11 @@
       </w:r>
     </w:p>
     <w:p>
+      <w:pPr>
+        <w:rPr>
+          <w:noProof/>
+        </w:rPr>
+      </w:pPr>
       <w:r>
         <w:rPr>
           <w:noProof/>
@@ -25064,12 +25471,11 @@
         </w:drawing>
       </w:r>
     </w:p>
+    <w:p/>
     <w:p>
       <w:r>
         <w:t>At this point, I haven’t added the PCF control yet. That comes later once it’s built and ready. Still, the app is already usable for creating and checking group records, which is helpful for preparing test data later on.</w:t>
       </w:r>
-    </w:p>
-    <w:p>
       <w:r>
         <w:br w:type="page"/>
       </w:r>
@@ -25081,6 +25487,7 @@
           <w:tab w:val="left" w:pos="2216"/>
         </w:tabs>
       </w:pPr>
+      <w:bookmarkStart w:id="51" w:name="_Toc228774680"/>
       <w:r>
         <w:lastRenderedPageBreak/>
         <w:t>5.3</w:t>
@@ -25091,6 +25498,7 @@
       <w:r>
         <w:t>Set Up PCF Project in app</w:t>
       </w:r>
+      <w:bookmarkEnd w:id="51"/>
       <w:r>
         <w:tab/>
       </w:r>
@@ -25157,7 +25565,13 @@
         <w:t>template</w:t>
       </w:r>
       <w:r>
-        <w:t xml:space="preserve"> file HelloWorld.tsx was immediately deleted and replaced with DuplicateMergeView.tsx as the main React component, and index.ts was rewritten to serve as a thin wrapper per the godiz ag PCF development guidelines.</w:t>
+        <w:t xml:space="preserve"> file HelloWorld.tsx was </w:t>
+      </w:r>
+      <w:r>
+        <w:t>promptly</w:t>
+      </w:r>
+      <w:r>
+        <w:t xml:space="preserve"> deleted and replaced with DuplicateMergeView.tsx as the main React component, and index.ts was rewritten to serve as a thin wrapper per the godiz ag PCF development guidelines.</w:t>
       </w:r>
     </w:p>
     <w:p>
@@ -25165,8 +25579,11 @@
         <w:jc w:val="both"/>
       </w:pPr>
       <w:r>
+        <w:rPr>
+          <w:noProof/>
+        </w:rPr>
         <w:drawing>
-          <wp:anchor distT="0" distB="0" distL="114300" distR="114300" simplePos="0" relativeHeight="251660800" behindDoc="1" locked="0" layoutInCell="1" allowOverlap="1" wp14:anchorId="05192C3A" wp14:editId="0A57536A">
+          <wp:anchor distT="0" distB="0" distL="114300" distR="114300" simplePos="0" relativeHeight="251662336" behindDoc="1" locked="0" layoutInCell="1" allowOverlap="1" wp14:anchorId="05192C3A" wp14:editId="0A57536A">
             <wp:simplePos x="0" y="0"/>
             <wp:positionH relativeFrom="margin">
               <wp:align>right</wp:align>
@@ -25236,7 +25653,23 @@
         <w:t>/</w:t>
       </w:r>
       <w:r>
-        <w:t xml:space="preserve"> components/handlers/ hooks/ and utils/ directories. The groupId bound property was added to ControlManifest.Input.xml and manifest types were regenerated using npm run refreshTypes to make the property available via context.parameters.</w:t>
+        <w:t xml:space="preserve"> components/</w:t>
+      </w:r>
+      <w:proofErr w:type="gramStart"/>
+      <w:r>
+        <w:t>handlers</w:t>
+      </w:r>
+      <w:proofErr w:type="gramEnd"/>
+      <w:r>
+        <w:t xml:space="preserve">/ hooks/ and utils/ directories. The groupId bound property was added to ControlManifest.Input.xml and manifest types were regenerated using npm run refreshTypes to make the property available via </w:t>
+      </w:r>
+      <w:proofErr w:type="gramStart"/>
+      <w:r>
+        <w:t>context.parameters</w:t>
+      </w:r>
+      <w:proofErr w:type="gramEnd"/>
+      <w:r>
+        <w:t>.</w:t>
       </w:r>
     </w:p>
     <w:p>
@@ -25256,13 +25689,7 @@
         <w:t xml:space="preserve"> </w:t>
       </w:r>
       <w:r>
-        <w:t>npm install</w:t>
-      </w:r>
-      <w:r>
-        <w:t xml:space="preserve">, </w:t>
-      </w:r>
-      <w:r>
-        <w:t>npm start watch</w:t>
+        <w:t>npm install, npm start watch</w:t>
       </w:r>
     </w:p>
     <w:p>
@@ -25270,16 +25697,16 @@
         <w:jc w:val="both"/>
       </w:pPr>
       <w:r>
-        <w:t xml:space="preserve">This spun up the </w:t>
+        <w:t>This</w:t>
+      </w:r>
+      <w:r>
+        <w:t xml:space="preserve"> </w:t>
       </w:r>
       <w:r>
         <w:t>created a temporary local view</w:t>
       </w:r>
       <w:r>
-        <w:t xml:space="preserve"> at https://localhost:8181, confirming the project was correctly configured and ready for implementation.</w:t>
-      </w:r>
-      <w:r>
-        <w:t xml:space="preserve"> </w:t>
+        <w:t xml:space="preserve"> at https://localhost:8181, confirming the project was correctly configured and ready for implementation. </w:t>
       </w:r>
     </w:p>
     <w:p>
@@ -25298,7 +25725,11 @@
     <w:p>
       <w:pPr>
         <w:pStyle w:val="Heading2"/>
-      </w:pPr>
+        <w:tabs>
+          <w:tab w:val="left" w:pos="3690"/>
+        </w:tabs>
+      </w:pPr>
+      <w:bookmarkStart w:id="52" w:name="_Toc228774681"/>
       <w:r>
         <w:lastRenderedPageBreak/>
         <w:t>5.4</w:t>
@@ -25308,6 +25739,216 @@
       </w:r>
       <w:r>
         <w:t>Data Fetching Layer</w:t>
+      </w:r>
+      <w:bookmarkEnd w:id="52"/>
+      <w:r>
+        <w:tab/>
+      </w:r>
+    </w:p>
+    <w:p>
+      <w:r>
+        <w:t>The data fetching layer was created in its own file, WebApiService, keeping all Web API calls centralized in one place. This keeps the component code clean and makes it easier to test or modify later.</w:t>
+      </w:r>
+    </w:p>
+    <w:p>
+      <w:r>
+        <w:drawing>
+          <wp:anchor distT="0" distB="0" distL="114300" distR="114300" simplePos="0" relativeHeight="251662848" behindDoc="1" locked="0" layoutInCell="1" allowOverlap="1" wp14:anchorId="6A468E92" wp14:editId="6F929399">
+            <wp:simplePos x="0" y="0"/>
+            <wp:positionH relativeFrom="margin">
+              <wp:align>left</wp:align>
+            </wp:positionH>
+            <wp:positionV relativeFrom="paragraph">
+              <wp:posOffset>1173492</wp:posOffset>
+            </wp:positionV>
+            <wp:extent cx="4800600" cy="5418455"/>
+            <wp:effectExtent l="19050" t="19050" r="19050" b="10795"/>
+            <wp:wrapNone/>
+            <wp:docPr id="813385079" name="Picture 1" descr="An image depicting a structured data representation of a 'Duplicate Group' with various attributes and related records.&#10;&#10;AI-generated content may be incorrect."/>
+            <wp:cNvGraphicFramePr>
+              <a:graphicFrameLocks xmlns:a="http://schemas.openxmlformats.org/drawingml/2006/main" noChangeAspect="1"/>
+            </wp:cNvGraphicFramePr>
+            <a:graphic xmlns:a="http://schemas.openxmlformats.org/drawingml/2006/main">
+              <a:graphicData uri="http://schemas.openxmlformats.org/drawingml/2006/picture">
+                <pic:pic xmlns:pic="http://schemas.openxmlformats.org/drawingml/2006/picture">
+                  <pic:nvPicPr>
+                    <pic:cNvPr id="813385079" name="Picture 1" descr="An image depicting a structured data representation of a 'Duplicate Group' with various attributes and related records.&#10;&#10;AI-generated content may be incorrect."/>
+                    <pic:cNvPicPr/>
+                  </pic:nvPicPr>
+                  <pic:blipFill>
+                    <a:blip r:embed="rId27">
+                      <a:extLst>
+                        <a:ext uri="{28A0092B-C50C-407E-A947-70E740481C1C}">
+                          <a14:useLocalDpi xmlns:a14="http://schemas.microsoft.com/office/drawing/2010/main" val="0"/>
+                        </a:ext>
+                      </a:extLst>
+                    </a:blip>
+                    <a:stretch>
+                      <a:fillRect/>
+                    </a:stretch>
+                  </pic:blipFill>
+                  <pic:spPr>
+                    <a:xfrm>
+                      <a:off x="0" y="0"/>
+                      <a:ext cx="4800600" cy="5418455"/>
+                    </a:xfrm>
+                    <a:prstGeom prst="rect">
+                      <a:avLst/>
+                    </a:prstGeom>
+                    <a:ln>
+                      <a:solidFill>
+                        <a:schemeClr val="accent1"/>
+                      </a:solidFill>
+                    </a:ln>
+                  </pic:spPr>
+                </pic:pic>
+              </a:graphicData>
+            </a:graphic>
+          </wp:anchor>
+        </w:drawing>
+      </w:r>
+      <w:r>
+        <w:t xml:space="preserve">While not </w:t>
+      </w:r>
+      <w:r>
+        <w:t>exactly</w:t>
+      </w:r>
+      <w:r>
+        <w:t xml:space="preserve"> required </w:t>
+      </w:r>
+      <w:r>
+        <w:t>for this</w:t>
+      </w:r>
+      <w:r>
+        <w:t xml:space="preserve"> stage, I added a visual indicator in the DuplicateMergeView file to track progress </w:t>
+      </w:r>
+      <w:r>
+        <w:t xml:space="preserve">and review the format </w:t>
+      </w:r>
+      <w:r>
+        <w:t>with real Dataverse data. The following is an example with two referenced contacts, including the selected merge fields alongside required columns from both the duplicate group and duplicate reference.</w:t>
+      </w:r>
+    </w:p>
+    <w:p/>
+    <w:p/>
+    <w:p/>
+    <w:p/>
+    <w:p/>
+    <w:p/>
+    <w:p/>
+    <w:p/>
+    <w:p/>
+    <w:p/>
+    <w:p/>
+    <w:p/>
+    <w:p/>
+    <w:p/>
+    <w:p/>
+    <w:p/>
+    <w:p/>
+    <w:p/>
+    <w:p>
+      <w:r>
+        <w:br w:type="page"/>
+      </w:r>
+    </w:p>
+    <w:p>
+      <w:r>
+        <w:lastRenderedPageBreak/>
+        <w:t xml:space="preserve">For debugging the FetchXML query, I used XrmToolBox’s FetchXML Builder. </w:t>
+      </w:r>
+      <w:r>
+        <w:t>this only took me so far however as querying polymorphic lookups the way I did, resulted in an error</w:t>
+      </w:r>
+      <w:r>
+        <w:t>. The system expected a</w:t>
+      </w:r>
+      <w:r>
+        <w:t xml:space="preserve"> </w:t>
+      </w:r>
+      <w:r>
+        <w:t xml:space="preserve">GUID for the record ID but received an incorrectly formatted value, so it </w:t>
+      </w:r>
+      <w:r>
+        <w:t>threw an error</w:t>
+      </w:r>
+      <w:r>
+        <w:t>. This issue only occurred in FetchXML Builder, while the same query worked correctly when used with the Web API’s retrieveMultipleRecords. Because of this, I had to continue without relying on the tool.</w:t>
+      </w:r>
+    </w:p>
+    <w:p>
+      <w:r>
+        <w:br/>
+      </w:r>
+      <w:r>
+        <w:drawing>
+          <wp:inline distT="0" distB="0" distL="0" distR="0" wp14:anchorId="43CC5F33" wp14:editId="284AEF43">
+            <wp:extent cx="5731510" cy="818515"/>
+            <wp:effectExtent l="19050" t="19050" r="21590" b="19685"/>
+            <wp:docPr id="405967257" name="Picture 1" descr="The image shows a technical error message indicating a System.FormatException occurred when an unspecified input was incorrectly converted to a System.Guid attribute.&#10;&#10;AI-generated content may be incorrect."/>
+            <wp:cNvGraphicFramePr>
+              <a:graphicFrameLocks xmlns:a="http://schemas.openxmlformats.org/drawingml/2006/main" noChangeAspect="1"/>
+            </wp:cNvGraphicFramePr>
+            <a:graphic xmlns:a="http://schemas.openxmlformats.org/drawingml/2006/main">
+              <a:graphicData uri="http://schemas.openxmlformats.org/drawingml/2006/picture">
+                <pic:pic xmlns:pic="http://schemas.openxmlformats.org/drawingml/2006/picture">
+                  <pic:nvPicPr>
+                    <pic:cNvPr id="405967257" name="Picture 1" descr="The image shows a technical error message indicating a System.FormatException occurred when an unspecified input was incorrectly converted to a System.Guid attribute.&#10;&#10;AI-generated content may be incorrect."/>
+                    <pic:cNvPicPr/>
+                  </pic:nvPicPr>
+                  <pic:blipFill>
+                    <a:blip r:embed="rId28"/>
+                    <a:stretch>
+                      <a:fillRect/>
+                    </a:stretch>
+                  </pic:blipFill>
+                  <pic:spPr>
+                    <a:xfrm>
+                      <a:off x="0" y="0"/>
+                      <a:ext cx="5731510" cy="818515"/>
+                    </a:xfrm>
+                    <a:prstGeom prst="rect">
+                      <a:avLst/>
+                    </a:prstGeom>
+                    <a:ln>
+                      <a:solidFill>
+                        <a:schemeClr val="accent1"/>
+                      </a:solidFill>
+                    </a:ln>
+                  </pic:spPr>
+                </pic:pic>
+              </a:graphicData>
+            </a:graphic>
+          </wp:inline>
+        </w:drawing>
+      </w:r>
+    </w:p>
+    <w:p/>
+    <w:p>
+      <w:r>
+        <w:t>To make the data usable for the React interface I had to transform the raw Dataverse response. FetchXML returns flat rows of data even when using link entities. I built a mapToGroup method in the WebApiService that takes these flat rows and groups them by their reference ID using a JavaScript Map. This transforms the flat data into a structured nested object that the React component can easily iterate over.</w:t>
+      </w:r>
+    </w:p>
+    <w:p>
+      <w:r>
+        <w:t xml:space="preserve">To handle the polymorphic </w:t>
+      </w:r>
+      <w:r>
+        <w:t xml:space="preserve">lookup which </w:t>
+      </w:r>
+      <w:r>
+        <w:t xml:space="preserve">merges both Accounts and Contacts the data layer needed to dynamically resolve fields. I added methods to check the </w:t>
+      </w:r>
+      <w:proofErr w:type="spellStart"/>
+      <w:r>
+        <w:t>targetTable</w:t>
+      </w:r>
+      <w:proofErr w:type="spellEnd"/>
+      <w:r>
+        <w:t xml:space="preserve"> variable and determine which specific columns to extract from the payload</w:t>
+      </w:r>
+      <w:r>
+        <w:t xml:space="preserve"> </w:t>
       </w:r>
     </w:p>
     <w:p>
@@ -25320,73 +25961,141 @@
         <w:rPr>
           <w:lang w:val="en-CH"/>
         </w:rPr>
-        <w:t>The data fetching layer was implemented as a dedicated WebApiService class in utils/WebApiService.ts. Centralising all Web API calls in a single service class keeps the component layer free of data access logic and makes the fetching behaviour independently testable and replaceable.</w:t>
-      </w:r>
-    </w:p>
-    <w:p>
-      <w:pPr>
+        <w:t xml:space="preserve">I used React hooks to manage data fetching. A useEffect runs the API call when the component loads, and </w:t>
+      </w:r>
+      <w:proofErr w:type="spellStart"/>
+      <w:r>
         <w:rPr>
           <w:lang w:val="en-CH"/>
         </w:rPr>
-      </w:pPr>
+        <w:t>useState</w:t>
+      </w:r>
+      <w:proofErr w:type="spellEnd"/>
       <w:r>
         <w:rPr>
           <w:lang w:val="en-CH"/>
         </w:rPr>
-        <w:t>The service class accepts the PCF context object in its constructor, using context.webAPI for all Dataverse calls. This approach was chosen over raw fetch calls because context.webAPI handles authentication automatically within the Dynamics 365 session, removing the need to manage auth headers manually.</w:t>
-      </w:r>
-    </w:p>
-    <w:p>
-      <w:pPr>
+        <w:t xml:space="preserve"> shows a loading spinner. Once the data </w:t>
+      </w:r>
+      <w:r>
         <w:rPr>
           <w:lang w:val="en-CH"/>
         </w:rPr>
-      </w:pPr>
+        <w:t xml:space="preserve">either </w:t>
+      </w:r>
       <w:r>
         <w:rPr>
           <w:lang w:val="en-CH"/>
         </w:rPr>
-        <w:t>Data retrieval is performed using a single FetchXML query passed to context.webAPI.retrieveMultipleRecords. The query retrieves the jsp_duplicate_group record and expands into jsp_duplicate_record_reference rows via an inner link-entity, then further expands into both account and contact via outer link-entities on the polymorphic jsp_referenced_record_id field. This approach was selected based on the decision made in chapter 4.1, retrieving all required data in a single network request.</w:t>
-      </w:r>
-    </w:p>
-    <w:p>
-      <w:pPr>
+        <w:t>loads or fails, the spinner disappear</w:t>
+      </w:r>
+      <w:r>
         <w:rPr>
           <w:lang w:val="en-CH"/>
         </w:rPr>
-      </w:pPr>
+        <w:t>s</w:t>
+      </w:r>
       <w:r>
         <w:rPr>
           <w:lang w:val="en-CH"/>
         </w:rPr>
-        <w:t>Since FetchXML returns one flat row per reference record with all parent fields repeated, the mapToGroup method groups the result rows by reference ID to reconstruct the structured DuplicateGroup object consumed by the React layer. Formatted values for Choice and Lookup fields are extracted directly from the @OData.Community.Display.V1.FormattedValue annotations included automatically in the Dataverse response, avoiding the need for a separate metadata call to resolve option set labels.</w:t>
-      </w:r>
-    </w:p>
-    <w:p>
-      <w:pPr>
+        <w:t>.</w:t>
+      </w:r>
+      <w:r>
         <w:rPr>
           <w:lang w:val="en-CH"/>
         </w:rPr>
-      </w:pPr>
+        <w:t xml:space="preserve"> For </w:t>
+      </w:r>
       <w:r>
         <w:rPr>
           <w:lang w:val="en-CH"/>
         </w:rPr>
-        <w:t>The DuplicateMergeView component calls fetchDuplicateGroup on mount via a useEffect hook, handling the three possible load outcomes — a successful response renders a temporary JSON debug block to verify the returned data structure, zero linked records renders an empty state message, and more than five linked records renders a warning message blocking further interaction. All error paths include a specific error code per the error handling requirements defined in Z01.</w:t>
-      </w:r>
-    </w:p>
-    <w:p>
-      <w:pPr>
+        <w:t>now,</w:t>
+      </w:r>
+      <w:r>
         <w:rPr>
           <w:lang w:val="en-CH"/>
         </w:rPr>
-      </w:pPr>
+        <w:t xml:space="preserve"> the spinner </w:t>
+      </w:r>
       <w:r>
         <w:rPr>
           <w:lang w:val="en-CH"/>
         </w:rPr>
-        <w:t>To verify the fetching layer was functioning correctly before proceeding to the UI implementation, a test group record was manually created in Dataverse with three linked account records. Opening the form confirmed the control rendered the spinner during load and subsequently displayed the correct JSON structure including all field values and formatted labels.</w:t>
-      </w:r>
+        <w:t>is present for less than a second but will continue to be used later for the merge process</w:t>
+      </w:r>
+    </w:p>
+    <w:p>
+      <w:pPr>
+        <w:rPr>
+          <w:noProof/>
+        </w:rPr>
+      </w:pPr>
+      <w:r>
+        <w:rPr>
+          <w:lang w:val="en-CH"/>
+        </w:rPr>
+        <w:br/>
+      </w:r>
+      <w:r>
+        <w:rPr>
+          <w:noProof/>
+        </w:rPr>
+        <w:drawing>
+          <wp:inline distT="0" distB="0" distL="0" distR="0" wp14:anchorId="08249BEF" wp14:editId="1E135BE8">
+            <wp:extent cx="3980952" cy="657143"/>
+            <wp:effectExtent l="19050" t="19050" r="19685" b="10160"/>
+            <wp:docPr id="1172772618" name="Picture 1" descr="The image shows a computer interface with a Duplicate Group feature and a loading indicator for duplicating records.&#10;&#10;AI-generated content may be incorrect."/>
+            <wp:cNvGraphicFramePr>
+              <a:graphicFrameLocks xmlns:a="http://schemas.openxmlformats.org/drawingml/2006/main" noChangeAspect="1"/>
+            </wp:cNvGraphicFramePr>
+            <a:graphic xmlns:a="http://schemas.openxmlformats.org/drawingml/2006/main">
+              <a:graphicData uri="http://schemas.openxmlformats.org/drawingml/2006/picture">
+                <pic:pic xmlns:pic="http://schemas.openxmlformats.org/drawingml/2006/picture">
+                  <pic:nvPicPr>
+                    <pic:cNvPr id="1172772618" name="Picture 1" descr="The image shows a computer interface with a Duplicate Group feature and a loading indicator for duplicating records.&#10;&#10;AI-generated content may be incorrect."/>
+                    <pic:cNvPicPr/>
+                  </pic:nvPicPr>
+                  <pic:blipFill>
+                    <a:blip r:embed="rId29"/>
+                    <a:stretch>
+                      <a:fillRect/>
+                    </a:stretch>
+                  </pic:blipFill>
+                  <pic:spPr>
+                    <a:xfrm>
+                      <a:off x="0" y="0"/>
+                      <a:ext cx="3980952" cy="657143"/>
+                    </a:xfrm>
+                    <a:prstGeom prst="rect">
+                      <a:avLst/>
+                    </a:prstGeom>
+                    <a:ln>
+                      <a:solidFill>
+                        <a:schemeClr val="accent1"/>
+                      </a:solidFill>
+                    </a:ln>
+                  </pic:spPr>
+                </pic:pic>
+              </a:graphicData>
+            </a:graphic>
+          </wp:inline>
+        </w:drawing>
+      </w:r>
+      <w:r>
+        <w:rPr>
+          <w:noProof/>
+        </w:rPr>
+        <w:t xml:space="preserve"> </w:t>
+      </w:r>
+    </w:p>
+    <w:p>
+      <w:pPr>
+        <w:rPr>
+          <w:lang w:val="en-CH"/>
+        </w:rPr>
+      </w:pPr>
     </w:p>
     <w:p>
       <w:pPr>
@@ -25405,6 +26114,7 @@
       <w:pPr>
         <w:pStyle w:val="Heading2"/>
       </w:pPr>
+      <w:bookmarkStart w:id="53" w:name="_Toc228774682"/>
       <w:r>
         <w:lastRenderedPageBreak/>
         <w:t>5.5</w:t>
@@ -25415,6 +26125,7 @@
       <w:r>
         <w:t>Field Type Handlers</w:t>
       </w:r>
+      <w:bookmarkEnd w:id="53"/>
     </w:p>
     <w:p>
       <w:pPr>
@@ -25433,6 +26144,7 @@
       <w:pPr>
         <w:pStyle w:val="Heading2"/>
       </w:pPr>
+      <w:bookmarkStart w:id="54" w:name="_Toc228774683"/>
       <w:r>
         <w:lastRenderedPageBreak/>
         <w:t>5.6</w:t>
@@ -25443,6 +26155,7 @@
       <w:r>
         <w:t>Comparison UI</w:t>
       </w:r>
+      <w:bookmarkEnd w:id="54"/>
     </w:p>
     <w:p>
       <w:pPr>
@@ -25461,6 +26174,7 @@
       <w:pPr>
         <w:pStyle w:val="Heading2"/>
       </w:pPr>
+      <w:bookmarkStart w:id="55" w:name="_Toc228774684"/>
       <w:r>
         <w:lastRenderedPageBreak/>
         <w:t>5.7</w:t>
@@ -25471,6 +26185,7 @@
       <w:r>
         <w:t>Merge &amp; Deactivation Logic</w:t>
       </w:r>
+      <w:bookmarkEnd w:id="55"/>
     </w:p>
     <w:p>
       <w:pPr>
@@ -25489,10 +26204,12 @@
       <w:pPr>
         <w:pStyle w:val="Heading2"/>
       </w:pPr>
+      <w:bookmarkStart w:id="56" w:name="_Toc228774685"/>
       <w:r>
         <w:lastRenderedPageBreak/>
         <w:t>5.8</w:t>
       </w:r>
+      <w:bookmarkEnd w:id="56"/>
       <w:r>
         <w:t xml:space="preserve"> </w:t>
       </w:r>
@@ -25514,9 +26231,14 @@
       <w:pPr>
         <w:pStyle w:val="Heading2"/>
       </w:pPr>
+      <w:bookmarkStart w:id="57" w:name="_Toc228774686"/>
       <w:r>
         <w:lastRenderedPageBreak/>
-        <w:t xml:space="preserve">5.9 </w:t>
+        <w:t>5.9</w:t>
+      </w:r>
+      <w:bookmarkEnd w:id="57"/>
+      <w:r>
+        <w:t xml:space="preserve"> </w:t>
       </w:r>
     </w:p>
     <w:p>
@@ -25529,7 +26251,7 @@
         <w:pStyle w:val="Heading1"/>
         <w:jc w:val="both"/>
       </w:pPr>
-      <w:bookmarkStart w:id="50" w:name="_Toc228438133"/>
+      <w:bookmarkStart w:id="58" w:name="_Toc228774687"/>
       <w:r>
         <w:lastRenderedPageBreak/>
         <w:t>6</w:t>
@@ -25538,14 +26260,14 @@
         <w:tab/>
         <w:t>Control</w:t>
       </w:r>
-      <w:bookmarkEnd w:id="50"/>
+      <w:bookmarkEnd w:id="58"/>
     </w:p>
     <w:p/>
     <w:p>
       <w:pPr>
         <w:pStyle w:val="Heading2"/>
       </w:pPr>
-      <w:bookmarkStart w:id="51" w:name="_Toc228438134"/>
+      <w:bookmarkStart w:id="59" w:name="_Toc228774688"/>
       <w:r>
         <w:t>6.1</w:t>
       </w:r>
@@ -25553,7 +26275,7 @@
         <w:tab/>
         <w:t>Test Protocol</w:t>
       </w:r>
-      <w:bookmarkEnd w:id="51"/>
+      <w:bookmarkEnd w:id="59"/>
     </w:p>
     <w:p>
       <w:pPr>
@@ -25739,7 +26461,7 @@
         <w:pStyle w:val="Heading2"/>
         <w:jc w:val="both"/>
       </w:pPr>
-      <w:bookmarkStart w:id="52" w:name="_Toc228438135"/>
+      <w:bookmarkStart w:id="60" w:name="_Toc228774689"/>
       <w:r>
         <w:lastRenderedPageBreak/>
         <w:t>6.3</w:t>
@@ -25748,7 +26470,7 @@
         <w:tab/>
         <w:t>Boundary Testing</w:t>
       </w:r>
-      <w:bookmarkEnd w:id="52"/>
+      <w:bookmarkEnd w:id="60"/>
     </w:p>
     <w:p>
       <w:pPr>
@@ -25862,7 +26584,7 @@
       <w:pPr>
         <w:pStyle w:val="Heading1"/>
       </w:pPr>
-      <w:bookmarkStart w:id="53" w:name="_Toc228438136"/>
+      <w:bookmarkStart w:id="61" w:name="_Toc228774690"/>
       <w:r>
         <w:lastRenderedPageBreak/>
         <w:t>7</w:t>
@@ -25871,7 +26593,7 @@
         <w:tab/>
         <w:t>Evaluate</w:t>
       </w:r>
-      <w:bookmarkEnd w:id="53"/>
+      <w:bookmarkEnd w:id="61"/>
     </w:p>
     <w:p>
       <w:pPr>
@@ -25919,7 +26641,7 @@
       <w:pPr>
         <w:pStyle w:val="Heading2"/>
       </w:pPr>
-      <w:bookmarkStart w:id="54" w:name="_Toc228438137"/>
+      <w:bookmarkStart w:id="62" w:name="_Toc228774691"/>
       <w:r>
         <w:lastRenderedPageBreak/>
         <w:t>7.1</w:t>
@@ -25930,7 +26652,7 @@
       <w:r>
         <w:t>Reflection</w:t>
       </w:r>
-      <w:bookmarkEnd w:id="54"/>
+      <w:bookmarkEnd w:id="62"/>
     </w:p>
     <w:p>
       <w:r>
@@ -26032,7 +26754,7 @@
           <w:szCs w:val="24"/>
         </w:rPr>
       </w:pPr>
-      <w:bookmarkStart w:id="55" w:name="_Toc228438138"/>
+      <w:bookmarkStart w:id="63" w:name="_Toc228774692"/>
       <w:r>
         <w:lastRenderedPageBreak/>
         <w:t>7.</w:t>
@@ -26044,7 +26766,7 @@
         <w:tab/>
         <w:t>IPERKA concerns</w:t>
       </w:r>
-      <w:bookmarkEnd w:id="55"/>
+      <w:bookmarkEnd w:id="63"/>
     </w:p>
     <w:p>
       <w:pPr>
@@ -26072,7 +26794,7 @@
       <w:pPr>
         <w:pStyle w:val="Heading2"/>
       </w:pPr>
-      <w:bookmarkStart w:id="56" w:name="_Toc228438139"/>
+      <w:bookmarkStart w:id="64" w:name="_Toc228774693"/>
       <w:r>
         <w:lastRenderedPageBreak/>
         <w:t>7.3</w:t>
@@ -26081,7 +26803,7 @@
         <w:tab/>
         <w:t>Possible Future Improvement</w:t>
       </w:r>
-      <w:bookmarkEnd w:id="56"/>
+      <w:bookmarkEnd w:id="64"/>
     </w:p>
     <w:p>
       <w:pPr>
@@ -26112,12 +26834,12 @@
       <w:pPr>
         <w:pStyle w:val="Heading2"/>
       </w:pPr>
-      <w:bookmarkStart w:id="57" w:name="_Toc228438140"/>
+      <w:bookmarkStart w:id="65" w:name="_Toc228774694"/>
       <w:r>
         <w:lastRenderedPageBreak/>
         <w:t>7.4 Summary</w:t>
       </w:r>
-      <w:bookmarkEnd w:id="57"/>
+      <w:bookmarkEnd w:id="65"/>
     </w:p>
     <w:p/>
     <w:p>
@@ -26195,7 +26917,7 @@
       <w:pPr>
         <w:pStyle w:val="Heading1"/>
       </w:pPr>
-      <w:bookmarkStart w:id="58" w:name="_Toc228438141"/>
+      <w:bookmarkStart w:id="66" w:name="_Toc228774695"/>
       <w:r>
         <w:lastRenderedPageBreak/>
         <w:t>8</w:t>
@@ -26206,7 +26928,7 @@
       <w:r>
         <w:t>Appendix</w:t>
       </w:r>
-      <w:bookmarkEnd w:id="58"/>
+      <w:bookmarkEnd w:id="66"/>
     </w:p>
     <w:p>
       <w:pPr>
@@ -26218,7 +26940,7 @@
           <w:szCs w:val="28"/>
         </w:rPr>
       </w:pPr>
-      <w:bookmarkStart w:id="59" w:name="_Toc228438142"/>
+      <w:bookmarkStart w:id="67" w:name="_Toc228774696"/>
       <w:r>
         <w:t>8.1</w:t>
       </w:r>
@@ -26228,7 +26950,7 @@
       <w:r>
         <w:t>Glossary</w:t>
       </w:r>
-      <w:bookmarkEnd w:id="59"/>
+      <w:bookmarkEnd w:id="67"/>
     </w:p>
     <w:p>
       <w:pPr>
@@ -26495,7 +27217,7 @@
       <w:pPr>
         <w:pStyle w:val="Heading2"/>
       </w:pPr>
-      <w:bookmarkStart w:id="60" w:name="_Toc228438143"/>
+      <w:bookmarkStart w:id="68" w:name="_Toc228774697"/>
       <w:r>
         <w:lastRenderedPageBreak/>
         <w:t>8.2</w:t>
@@ -26506,7 +27228,7 @@
       <w:r>
         <w:t>Bibliography</w:t>
       </w:r>
-      <w:bookmarkEnd w:id="60"/>
+      <w:bookmarkEnd w:id="68"/>
     </w:p>
     <w:p/>
     <w:p>
@@ -26527,7 +27249,7 @@
       <w:pPr>
         <w:spacing w:line="240" w:lineRule="auto"/>
       </w:pPr>
-      <w:hyperlink r:id="rId27" w:history="1">
+      <w:hyperlink r:id="rId30" w:history="1">
         <w:r>
           <w:rPr>
             <w:rStyle w:val="Hyperlink"/>
@@ -26576,7 +27298,7 @@
       <w:r>
         <w:br/>
       </w:r>
-      <w:hyperlink r:id="rId28" w:history="1">
+      <w:hyperlink r:id="rId31" w:history="1">
         <w:r>
           <w:rPr>
             <w:rStyle w:val="Hyperlink"/>
@@ -26630,7 +27352,7 @@
       <w:r>
         <w:br/>
       </w:r>
-      <w:hyperlink r:id="rId29" w:history="1">
+      <w:hyperlink r:id="rId32" w:history="1">
         <w:r>
           <w:rPr>
             <w:rStyle w:val="Hyperlink"/>
@@ -26657,7 +27379,7 @@
       <w:r>
         <w:br/>
       </w:r>
-      <w:hyperlink r:id="rId30" w:history="1">
+      <w:hyperlink r:id="rId33" w:history="1">
         <w:r>
           <w:rPr>
             <w:rStyle w:val="Hyperlink"/>
@@ -26676,7 +27398,7 @@
       <w:pPr>
         <w:pStyle w:val="Heading2"/>
       </w:pPr>
-      <w:bookmarkStart w:id="61" w:name="_Toc228438144"/>
+      <w:bookmarkStart w:id="69" w:name="_Toc228774698"/>
       <w:r>
         <w:t>8.3</w:t>
       </w:r>
@@ -26686,7 +27408,7 @@
       <w:r>
         <w:t>Declaration of Independent Work</w:t>
       </w:r>
-      <w:bookmarkEnd w:id="61"/>
+      <w:bookmarkEnd w:id="69"/>
     </w:p>
     <w:p>
       <w:pPr>
@@ -26725,9 +27447,9 @@
     </w:p>
     <w:p/>
     <w:sectPr>
-      <w:headerReference w:type="default" r:id="rId31"/>
-      <w:footerReference w:type="default" r:id="rId32"/>
-      <w:headerReference w:type="first" r:id="rId33"/>
+      <w:headerReference w:type="default" r:id="rId34"/>
+      <w:footerReference w:type="default" r:id="rId35"/>
+      <w:headerReference w:type="first" r:id="rId36"/>
       <w:pgSz w:w="11906" w:h="16838"/>
       <w:pgMar w:top="1440" w:right="1440" w:bottom="1440" w:left="1440" w:header="454" w:footer="708" w:gutter="0"/>
       <w:cols w:space="708"/>
@@ -26828,7 +27550,7 @@
       <w:rPr>
         <w:noProof/>
       </w:rPr>
-      <w:t>30.04.2026</w:t>
+      <w:t>04.05.2026</w:t>
     </w:r>
     <w:r>
       <w:fldChar w:fldCharType="end"/>

</xml_diff>